<commit_message>
Business Case document finished and loaded to the repository
</commit_message>
<xml_diff>
--- a/docs/analysis/es/(I) 20260127 Mexus - Vision & Scope.docx
+++ b/docs/analysis/es/(I) 20260127 Mexus - Vision & Scope.docx
@@ -598,6 +598,8 @@
             <w:sdtEndPr>
               <w:rPr>
                 <w:color w:val="808080" w:themeColor="background1" w:themeShade="80"/>
+                <w:sz w:val="72"/>
+                <w:szCs w:val="72"/>
               </w:rPr>
             </w:sdtEndPr>
             <w:sdtContent>
@@ -608,13 +610,15 @@
                     <w:color w:val="3B3838" w:themeColor="background2" w:themeShade="40"/>
                   </w:rPr>
                 </w:pPr>
-                <w:r>
-                  <w:rPr>
-                    <w:noProof/>
-                    <w:color w:val="3B3838" w:themeColor="background2" w:themeShade="40"/>
-                  </w:rPr>
-                  <w:t>dcueli.com</w:t>
-                </w:r>
+                <w:hyperlink r:id="rId9" w:history="1">
+                  <w:r>
+                    <w:rPr>
+                      <w:rStyle w:val="Hipervnculo"/>
+                      <w:noProof/>
+                    </w:rPr>
+                    <w:t>dcueli.com</w:t>
+                  </w:r>
+                </w:hyperlink>
               </w:p>
               <w:p>
                 <w:pPr>
@@ -627,6 +631,8 @@
                   <w:rPr>
                     <w:noProof/>
                     <w:color w:val="808080" w:themeColor="background1" w:themeShade="80"/>
+                    <w:sz w:val="72"/>
+                    <w:szCs w:val="72"/>
                   </w:rPr>
                   <w:t>Visión &amp; alcance</w:t>
                 </w:r>
@@ -959,29 +965,14 @@
           <w:numId w:val="25"/>
         </w:numPr>
       </w:pPr>
-      <w:hyperlink w:anchor="_Objetivos_secundarios" w:history="1">
+      <w:hyperlink w:anchor="_Objetivos_específicos_de" w:history="1">
         <w:r>
           <w:rPr>
             <w:rStyle w:val="Hipervnculo"/>
           </w:rPr>
-          <w:t>Objetivo</w:t>
-        </w:r>
-        <w:r>
-          <w:rPr>
-            <w:rStyle w:val="Hipervnculo"/>
-          </w:rPr>
-          <w:t>s</w:t>
-        </w:r>
-        <w:r>
-          <w:rPr>
-            <w:rStyle w:val="Hipervnculo"/>
-          </w:rPr>
-          <w:t xml:space="preserve"> secundario</w:t>
+          <w:t>Objetivos secundarios</w:t>
         </w:r>
       </w:hyperlink>
-      <w:r>
-        <w:t>s</w:t>
-      </w:r>
     </w:p>
     <w:p>
       <w:pPr>
@@ -1319,7 +1310,7 @@
                               </w:rPr>
                               <w:t xml:space="preserve">de </w:t>
                             </w:r>
-                            <w:hyperlink r:id="rId9" w:history="1">
+                            <w:hyperlink r:id="rId10" w:history="1">
                               <w:r>
                                 <w:rPr>
                                   <w:rStyle w:val="Hipervnculo"/>
@@ -1381,7 +1372,7 @@
                                 <w:lang w:bidi="es-ES"/>
                               </w:rPr>
                             </w:pPr>
-                            <w:hyperlink r:id="rId10" w:history="1">
+                            <w:hyperlink r:id="rId11" w:history="1">
                               <w:r>
                                 <w:rPr>
                                   <w:rStyle w:val="Hipervnculo"/>
@@ -1467,7 +1458,7 @@
                         </w:rPr>
                         <w:t xml:space="preserve">de </w:t>
                       </w:r>
-                      <w:hyperlink r:id="rId11" w:history="1">
+                      <w:hyperlink r:id="rId12" w:history="1">
                         <w:r>
                           <w:rPr>
                             <w:rStyle w:val="Hipervnculo"/>
@@ -1529,7 +1520,7 @@
                           <w:lang w:bidi="es-ES"/>
                         </w:rPr>
                       </w:pPr>
-                      <w:hyperlink r:id="rId12" w:history="1">
+                      <w:hyperlink r:id="rId13" w:history="1">
                         <w:r>
                           <w:rPr>
                             <w:rStyle w:val="Hipervnculo"/>
@@ -1595,10 +1586,10 @@
         <w:tblLook w:val="04A0" w:firstRow="1" w:lastRow="0" w:firstColumn="1" w:lastColumn="0" w:noHBand="0" w:noVBand="1"/>
       </w:tblPr>
       <w:tblGrid>
-        <w:gridCol w:w="1063"/>
-        <w:gridCol w:w="2514"/>
-        <w:gridCol w:w="4981"/>
-        <w:gridCol w:w="1476"/>
+        <w:gridCol w:w="1064"/>
+        <w:gridCol w:w="1612"/>
+        <w:gridCol w:w="6411"/>
+        <w:gridCol w:w="947"/>
       </w:tblGrid>
       <w:tr>
         <w:trPr>
@@ -1607,7 +1598,7 @@
         <w:tc>
           <w:tcPr>
             <w:cnfStyle w:val="001000000100" w:firstRow="0" w:lastRow="0" w:firstColumn="1" w:lastColumn="0" w:oddVBand="0" w:evenVBand="0" w:oddHBand="0" w:evenHBand="0" w:firstRowFirstColumn="1" w:firstRowLastColumn="0" w:lastRowFirstColumn="0" w:lastRowLastColumn="0"/>
-            <w:tcW w:w="529" w:type="pct"/>
+            <w:tcW w:w="530" w:type="pct"/>
             <w:hideMark/>
           </w:tcPr>
           <w:p>
@@ -1700,7 +1691,7 @@
         <w:tc>
           <w:tcPr>
             <w:cnfStyle w:val="001000000000" w:firstRow="0" w:lastRow="0" w:firstColumn="1" w:lastColumn="0" w:oddVBand="0" w:evenVBand="0" w:oddHBand="0" w:evenHBand="0" w:firstRowFirstColumn="0" w:firstRowLastColumn="0" w:lastRowFirstColumn="0" w:lastRowLastColumn="0"/>
-            <w:tcW w:w="529" w:type="pct"/>
+            <w:tcW w:w="530" w:type="pct"/>
             <w:hideMark/>
           </w:tcPr>
           <w:p>
@@ -1824,7 +1815,7 @@
         <w:tc>
           <w:tcPr>
             <w:cnfStyle w:val="001000000000" w:firstRow="0" w:lastRow="0" w:firstColumn="1" w:lastColumn="0" w:oddVBand="0" w:evenVBand="0" w:oddHBand="0" w:evenHBand="0" w:firstRowFirstColumn="0" w:firstRowLastColumn="0" w:lastRowFirstColumn="0" w:lastRowLastColumn="0"/>
-            <w:tcW w:w="529" w:type="pct"/>
+            <w:tcW w:w="530" w:type="pct"/>
             <w:hideMark/>
           </w:tcPr>
           <w:p>
@@ -1950,7 +1941,7 @@
         <w:tc>
           <w:tcPr>
             <w:cnfStyle w:val="001000000000" w:firstRow="0" w:lastRow="0" w:firstColumn="1" w:lastColumn="0" w:oddVBand="0" w:evenVBand="0" w:oddHBand="0" w:evenHBand="0" w:firstRowFirstColumn="0" w:firstRowLastColumn="0" w:lastRowFirstColumn="0" w:lastRowLastColumn="0"/>
-            <w:tcW w:w="529" w:type="pct"/>
+            <w:tcW w:w="530" w:type="pct"/>
             <w:hideMark/>
           </w:tcPr>
           <w:p>
@@ -2196,6 +2187,70 @@
           </w:p>
         </w:tc>
       </w:tr>
+      <w:tr>
+        <w:tc>
+          <w:tcPr>
+            <w:cnfStyle w:val="001000000000" w:firstRow="0" w:lastRow="0" w:firstColumn="1" w:lastColumn="0" w:oddVBand="0" w:evenVBand="0" w:oddHBand="0" w:evenHBand="0" w:firstRowFirstColumn="0" w:firstRowLastColumn="0" w:lastRowFirstColumn="0" w:lastRowLastColumn="0"/>
+            <w:tcW w:w="530" w:type="pct"/>
+            <w:shd w:val="clear" w:color="auto" w:fill="auto"/>
+          </w:tcPr>
+          <w:p>
+            <w:pPr>
+              <w:pStyle w:val="Contenido"/>
+            </w:pPr>
+          </w:p>
+        </w:tc>
+        <w:tc>
+          <w:tcPr>
+            <w:tcW w:w="0" w:type="auto"/>
+          </w:tcPr>
+          <w:p>
+            <w:pPr>
+              <w:pStyle w:val="Contenido"/>
+              <w:cnfStyle w:val="000000000000" w:firstRow="0" w:lastRow="0" w:firstColumn="0" w:lastColumn="0" w:oddVBand="0" w:evenVBand="0" w:oddHBand="0" w:evenHBand="0" w:firstRowFirstColumn="0" w:firstRowLastColumn="0" w:lastRowFirstColumn="0" w:lastRowLastColumn="0"/>
+              <w:rPr>
+                <w:i/>
+                <w:iCs/>
+              </w:rPr>
+            </w:pPr>
+            <w:r>
+              <w:rPr>
+                <w:i/>
+                <w:iCs/>
+              </w:rPr>
+              <w:t>30/01/2026</w:t>
+            </w:r>
+          </w:p>
+        </w:tc>
+        <w:tc>
+          <w:tcPr>
+            <w:tcW w:w="0" w:type="auto"/>
+          </w:tcPr>
+          <w:p>
+            <w:pPr>
+              <w:pStyle w:val="Contenido"/>
+              <w:cnfStyle w:val="000000000000" w:firstRow="0" w:lastRow="0" w:firstColumn="0" w:lastColumn="0" w:oddVBand="0" w:evenVBand="0" w:oddHBand="0" w:evenHBand="0" w:firstRowFirstColumn="0" w:firstRowLastColumn="0" w:lastRowFirstColumn="0" w:lastRowLastColumn="0"/>
+            </w:pPr>
+            <w:r>
+              <w:t>Modificaciones mínimas visuales y de acceso a enlaces</w:t>
+            </w:r>
+          </w:p>
+        </w:tc>
+        <w:tc>
+          <w:tcPr>
+            <w:tcW w:w="0" w:type="auto"/>
+          </w:tcPr>
+          <w:p>
+            <w:pPr>
+              <w:pStyle w:val="Contenido"/>
+              <w:cnfStyle w:val="000000000000" w:firstRow="0" w:lastRow="0" w:firstColumn="0" w:lastColumn="0" w:oddVBand="0" w:evenVBand="0" w:oddHBand="0" w:evenHBand="0" w:firstRowFirstColumn="0" w:firstRowLastColumn="0" w:lastRowFirstColumn="0" w:lastRowLastColumn="0"/>
+            </w:pPr>
+            <w:r>
+              <w:t>dcueli</w:t>
+            </w:r>
+          </w:p>
+        </w:tc>
+      </w:tr>
     </w:tbl>
     <w:p>
       <w:pPr>
@@ -2236,19 +2291,7 @@
           <w:rPr>
             <w:rStyle w:val="HipervnculoalndiceCar"/>
           </w:rPr>
-          <w:t>- ir al ín</w:t>
-        </w:r>
-        <w:r>
-          <w:rPr>
-            <w:rStyle w:val="HipervnculoalndiceCar"/>
-          </w:rPr>
-          <w:t>d</w:t>
-        </w:r>
-        <w:r>
-          <w:rPr>
-            <w:rStyle w:val="HipervnculoalndiceCar"/>
-          </w:rPr>
-          <w:t>ice -</w:t>
+          <w:t>- ir al índice -</w:t>
         </w:r>
       </w:hyperlink>
     </w:p>
@@ -2717,7 +2760,25 @@
         <w:rPr>
           <w:lang w:eastAsia="es-ES"/>
         </w:rPr>
-        <w:t>instrucciones, acuerdos verbales, entrevistas, etc; de forma fiable y organizada, sin depender de aplicaciones de terceros que:</w:t>
+        <w:t>tareas</w:t>
+      </w:r>
+      <w:r>
+        <w:rPr>
+          <w:lang w:eastAsia="es-ES"/>
+        </w:rPr>
+        <w:t xml:space="preserve">, acuerdos verbales, entrevistas, </w:t>
+      </w:r>
+      <w:r>
+        <w:rPr>
+          <w:lang w:eastAsia="es-ES"/>
+        </w:rPr>
+        <w:t xml:space="preserve">instrucciones, </w:t>
+      </w:r>
+      <w:r>
+        <w:rPr>
+          <w:lang w:eastAsia="es-ES"/>
+        </w:rPr>
+        <w:t>etc; de forma fiable y organizada, sin depender de aplicaciones de terceros que:</w:t>
       </w:r>
     </w:p>
     <w:p>
@@ -4349,8 +4410,8 @@
       </w:pPr>
     </w:p>
     <w:sectPr>
-      <w:headerReference w:type="default" r:id="rId13"/>
-      <w:footerReference w:type="default" r:id="rId14"/>
+      <w:headerReference w:type="default" r:id="rId14"/>
+      <w:footerReference w:type="default" r:id="rId15"/>
       <w:pgSz w:w="11906" w:h="16838" w:code="9"/>
       <w:pgMar w:top="720" w:right="936" w:bottom="720" w:left="936" w:header="0" w:footer="289" w:gutter="0"/>
       <w:pgNumType w:start="1"/>
@@ -4862,7 +4923,7 @@
         <v:path o:extrusionok="f" gradientshapeok="t" o:connecttype="rect"/>
         <o:lock v:ext="edit" aspectratio="t"/>
       </v:shapetype>
-      <v:shape id="_x0000_i1025" type="#_x0000_t75" style="width:441.75pt;height:305.25pt" o:bullet="t">
+      <v:shape id="_x0000_i1025" type="#_x0000_t75" style="width:441.45pt;height:305.1pt" o:bullet="t">
         <v:imagedata r:id="rId1" o:title="folder-309052_1280[1]"/>
       </v:shape>
     </w:pict>
@@ -13201,10 +13262,13 @@
     <w:rsid w:val="00115480"/>
     <w:rsid w:val="00130F2A"/>
     <w:rsid w:val="001448B7"/>
+    <w:rsid w:val="0022094C"/>
     <w:rsid w:val="0023140F"/>
     <w:rsid w:val="002C5662"/>
+    <w:rsid w:val="002D7BDE"/>
     <w:rsid w:val="004010E7"/>
     <w:rsid w:val="00484ABF"/>
+    <w:rsid w:val="005B625B"/>
     <w:rsid w:val="006B176B"/>
     <w:rsid w:val="00960C1A"/>
     <w:rsid w:val="00C94860"/>

</xml_diff>

<commit_message>
Writting up the SRS Document (Stakeholders & Requirements/Needs)
</commit_message>
<xml_diff>
--- a/docs/analysis/es/(I) 20260127 Mexus - Vision & Scope.docx
+++ b/docs/analysis/es/(I) 20260127 Mexus - Vision & Scope.docx
@@ -1610,7 +1610,7 @@
             </w:pPr>
             <w:r>
               <w:rPr>
-                <w:rStyle w:val="Textoennegrita"/>
+                <w:rStyle w:val="Fuerte"/>
                 <w:b/>
               </w:rPr>
               <w:t>Versión</w:t>
@@ -1632,7 +1632,7 @@
             </w:pPr>
             <w:r>
               <w:rPr>
-                <w:rStyle w:val="Textoennegrita"/>
+                <w:rStyle w:val="Fuerte"/>
                 <w:b/>
               </w:rPr>
               <w:t>Fecha</w:t>
@@ -1654,7 +1654,7 @@
             </w:pPr>
             <w:r>
               <w:rPr>
-                <w:rStyle w:val="Textoennegrita"/>
+                <w:rStyle w:val="Fuerte"/>
                 <w:b/>
               </w:rPr>
               <w:t>Cambios realizados</w:t>
@@ -1676,7 +1676,7 @@
             </w:pPr>
             <w:r>
               <w:rPr>
-                <w:rStyle w:val="Textoennegrita"/>
+                <w:rStyle w:val="Fuerte"/>
                 <w:b/>
               </w:rPr>
               <w:t>Autor</w:t>
@@ -3615,6 +3615,11 @@
       </w:pPr>
       <w:bookmarkStart w:id="24" w:name="_Alcance_incluido_(in-scope)"/>
       <w:bookmarkEnd w:id="24"/>
+    </w:p>
+    <w:p>
+      <w:pPr>
+        <w:pStyle w:val="Ttulo2"/>
+      </w:pPr>
       <w:r>
         <w:t>Alcance incluido (in-scope) para Mexus 0.1.0</w:t>
       </w:r>
@@ -3718,6 +3723,7 @@
         </w:numPr>
       </w:pPr>
       <w:r>
+        <w:lastRenderedPageBreak/>
         <w:t>Configuración de qué tipos de llamadas se grabarán: salientes, entrantes o ambas.</w:t>
       </w:r>
     </w:p>
@@ -3742,7 +3748,6 @@
         </w:numPr>
       </w:pPr>
       <w:r>
-        <w:lastRenderedPageBreak/>
         <w:t>Listado de grabaciones disponibles con metadatos básicos (fecha/hora, duración, tipo de llamada, número).</w:t>
       </w:r>
     </w:p>
@@ -3918,6 +3923,11 @@
       </w:pPr>
       <w:bookmarkStart w:id="27" w:name="_Stakeholders_clave"/>
       <w:bookmarkEnd w:id="27"/>
+    </w:p>
+    <w:p>
+      <w:pPr>
+        <w:pStyle w:val="Ttulo2"/>
+      </w:pPr>
       <w:r>
         <w:t>Stakeholders clave</w:t>
       </w:r>
@@ -4042,11 +4052,33 @@
     <w:p/>
     <w:p>
       <w:pPr>
-        <w:pStyle w:val="Ttulo1"/>
+        <w:spacing w:after="200" w:line="276" w:lineRule="auto"/>
+        <w:contextualSpacing w:val="0"/>
+        <w:rPr>
+          <w:rFonts w:ascii="Calibri Light" w:eastAsiaTheme="majorEastAsia" w:hAnsi="Calibri Light" w:cstheme="majorBidi"/>
+          <w:color w:val="FFFFFF" w:themeColor="background1"/>
+          <w:kern w:val="28"/>
+          <w:sz w:val="44"/>
+          <w:szCs w:val="40"/>
+          <w14:textOutline w14:w="9525" w14:cap="rnd" w14:cmpd="sng" w14:algn="ctr">
+            <w14:noFill/>
+            <w14:prstDash w14:val="solid"/>
+            <w14:bevel/>
+          </w14:textOutline>
+        </w:rPr>
       </w:pPr>
       <w:bookmarkStart w:id="28" w:name="_BENEFICIOS_ESPERADOS"/>
       <w:bookmarkEnd w:id="28"/>
       <w:r>
+        <w:br w:type="page"/>
+      </w:r>
+    </w:p>
+    <w:p>
+      <w:pPr>
+        <w:pStyle w:val="Ttulo1"/>
+      </w:pPr>
+      <w:r>
+        <w:lastRenderedPageBreak/>
         <w:t>BENEFICIOS ESPERADOS</w:t>
       </w:r>
       <w:r>
@@ -4104,7 +4136,6 @@
       <w:bookmarkStart w:id="30" w:name="_SUPUESTOS_Y_RESTRICCIONES"/>
       <w:bookmarkEnd w:id="30"/>
       <w:r>
-        <w:lastRenderedPageBreak/>
         <w:t>S</w:t>
       </w:r>
       <w:r>
@@ -4123,11 +4154,13 @@
       </w:hyperlink>
     </w:p>
     <w:p>
-      <w:pPr>
-        <w:pStyle w:val="Ttulo2"/>
-      </w:pPr>
       <w:bookmarkStart w:id="31" w:name="_Supuestos"/>
       <w:bookmarkEnd w:id="31"/>
+    </w:p>
+    <w:p>
+      <w:pPr>
+        <w:pStyle w:val="Ttulo2"/>
+      </w:pPr>
       <w:r>
         <w:t>Supuestos</w:t>
       </w:r>
@@ -4263,6 +4296,19 @@
       </w:r>
       <w:r>
         <w:t>.</w:t>
+      </w:r>
+    </w:p>
+    <w:p>
+      <w:pPr>
+        <w:pStyle w:val="Contenido"/>
+      </w:pPr>
+    </w:p>
+    <w:p>
+      <w:pPr>
+        <w:pStyle w:val="NormalWeb"/>
+      </w:pPr>
+      <w:r>
+        <w:t>La gestión del proyecto se alineará con buenas prácticas de gestión de proyectos reconocidas internacionalmente (PMBOK/PRINCE2), adaptadas a la naturaleza y alcance del presente proyecto.</w:t>
       </w:r>
     </w:p>
     <w:p>
@@ -12162,7 +12208,6 @@
   <w:style w:type="character" w:default="1" w:styleId="Fuentedeprrafopredeter">
     <w:name w:val="Default Paragraph Font"/>
     <w:uiPriority w:val="1"/>
-    <w:semiHidden/>
     <w:unhideWhenUsed/>
   </w:style>
   <w:style w:type="table" w:default="1" w:styleId="Tablanormal">
@@ -12467,7 +12512,7 @@
       <w:lang w:eastAsia="es-ES"/>
     </w:rPr>
   </w:style>
-  <w:style w:type="character" w:styleId="Textoennegrita">
+  <w:style w:type="character" w:styleId="Fuerte">
     <w:name w:val="Strong"/>
     <w:uiPriority w:val="22"/>
     <w:qFormat/>
@@ -13262,6 +13307,7 @@
     <w:rsid w:val="00115480"/>
     <w:rsid w:val="00130F2A"/>
     <w:rsid w:val="001448B7"/>
+    <w:rsid w:val="001D7413"/>
     <w:rsid w:val="0022094C"/>
     <w:rsid w:val="0023140F"/>
     <w:rsid w:val="002C5662"/>
@@ -13273,6 +13319,7 @@
     <w:rsid w:val="00960C1A"/>
     <w:rsid w:val="00C94860"/>
     <w:rsid w:val="00D6343F"/>
+    <w:rsid w:val="00E62476"/>
     <w:rsid w:val="00EF27E6"/>
   </w:rsids>
   <m:mathPr>

</xml_diff>

<commit_message>
SRS finished and sent to revision. Finished all previous documents
</commit_message>
<xml_diff>
--- a/docs/analysis/es/(I) 20260127 Mexus - Vision & Scope.docx
+++ b/docs/analysis/es/(I) 20260127 Mexus - Vision & Scope.docx
@@ -149,6 +149,7 @@
                                       <w:sz w:val="44"/>
                                     </w:rPr>
                                   </w:pPr>
+                                  <w:proofErr w:type="spellStart"/>
                                   <w:r>
                                     <w:rPr>
                                       <w:color w:val="FFFFFF" w:themeColor="background1"/>
@@ -156,6 +157,7 @@
                                     </w:rPr>
                                     <w:t>Mexus</w:t>
                                   </w:r>
+                                  <w:proofErr w:type="spellEnd"/>
                                 </w:p>
                                 <w:p>
                                   <w:pPr>
@@ -223,6 +225,7 @@
                                 <w:sz w:val="44"/>
                               </w:rPr>
                             </w:pPr>
+                            <w:proofErr w:type="spellStart"/>
                             <w:r>
                               <w:rPr>
                                 <w:color w:val="FFFFFF" w:themeColor="background1"/>
@@ -230,6 +233,7 @@
                               </w:rPr>
                               <w:t>Mexus</w:t>
                             </w:r>
+                            <w:proofErr w:type="spellEnd"/>
                           </w:p>
                           <w:p>
                             <w:pPr>
@@ -753,6 +757,352 @@
         <w:rPr>
           <w:rFonts w:asciiTheme="minorHAnsi" w:hAnsiTheme="minorHAnsi" w:cstheme="minorHAnsi"/>
         </w:rPr>
+        <w:t>Visión y Alcance</w:t>
+      </w:r>
+    </w:p>
+    <w:p/>
+    <w:tbl>
+      <w:tblPr>
+        <w:tblStyle w:val="Tablaconcuadrcula7concolores-nfasis1"/>
+        <w:tblW w:w="0" w:type="auto"/>
+        <w:tblLook w:val="04A0" w:firstRow="1" w:lastRow="0" w:firstColumn="1" w:lastColumn="0" w:noHBand="0" w:noVBand="1"/>
+      </w:tblPr>
+      <w:tblGrid>
+        <w:gridCol w:w="2077"/>
+        <w:gridCol w:w="7897"/>
+      </w:tblGrid>
+      <w:tr>
+        <w:trPr>
+          <w:cnfStyle w:val="100000000000" w:firstRow="1" w:lastRow="0" w:firstColumn="0" w:lastColumn="0" w:oddVBand="0" w:evenVBand="0" w:oddHBand="0" w:evenHBand="0" w:firstRowFirstColumn="0" w:firstRowLastColumn="0" w:lastRowFirstColumn="0" w:lastRowLastColumn="0"/>
+        </w:trPr>
+        <w:tc>
+          <w:tcPr>
+            <w:cnfStyle w:val="001000000100" w:firstRow="0" w:lastRow="0" w:firstColumn="1" w:lastColumn="0" w:oddVBand="0" w:evenVBand="0" w:oddHBand="0" w:evenHBand="0" w:firstRowFirstColumn="1" w:firstRowLastColumn="0" w:lastRowFirstColumn="0" w:lastRowLastColumn="0"/>
+            <w:tcW w:w="2077" w:type="dxa"/>
+          </w:tcPr>
+          <w:p>
+            <w:pPr>
+              <w:jc w:val="both"/>
+              <w:rPr>
+                <w:b w:val="0"/>
+                <w:bCs w:val="0"/>
+                <w:color w:val="auto"/>
+              </w:rPr>
+            </w:pPr>
+            <w:r>
+              <w:rPr>
+                <w:color w:val="auto"/>
+              </w:rPr>
+              <w:t>Proyecto</w:t>
+            </w:r>
+          </w:p>
+        </w:tc>
+        <w:tc>
+          <w:tcPr>
+            <w:tcW w:w="7897" w:type="dxa"/>
+          </w:tcPr>
+          <w:p>
+            <w:pPr>
+              <w:jc w:val="both"/>
+              <w:cnfStyle w:val="100000000000" w:firstRow="1" w:lastRow="0" w:firstColumn="0" w:lastColumn="0" w:oddVBand="0" w:evenVBand="0" w:oddHBand="0" w:evenHBand="0" w:firstRowFirstColumn="0" w:firstRowLastColumn="0" w:lastRowFirstColumn="0" w:lastRowLastColumn="0"/>
+              <w:rPr>
+                <w:color w:val="auto"/>
+              </w:rPr>
+            </w:pPr>
+            <w:proofErr w:type="spellStart"/>
+            <w:r>
+              <w:rPr>
+                <w:color w:val="auto"/>
+              </w:rPr>
+              <w:t>Mexus</w:t>
+            </w:r>
+            <w:proofErr w:type="spellEnd"/>
+          </w:p>
+        </w:tc>
+      </w:tr>
+      <w:tr>
+        <w:trPr>
+          <w:cnfStyle w:val="000000100000" w:firstRow="0" w:lastRow="0" w:firstColumn="0" w:lastColumn="0" w:oddVBand="0" w:evenVBand="0" w:oddHBand="1" w:evenHBand="0" w:firstRowFirstColumn="0" w:firstRowLastColumn="0" w:lastRowFirstColumn="0" w:lastRowLastColumn="0"/>
+        </w:trPr>
+        <w:tc>
+          <w:tcPr>
+            <w:cnfStyle w:val="001000000000" w:firstRow="0" w:lastRow="0" w:firstColumn="1" w:lastColumn="0" w:oddVBand="0" w:evenVBand="0" w:oddHBand="0" w:evenHBand="0" w:firstRowFirstColumn="0" w:firstRowLastColumn="0" w:lastRowFirstColumn="0" w:lastRowLastColumn="0"/>
+            <w:tcW w:w="2077" w:type="dxa"/>
+          </w:tcPr>
+          <w:p>
+            <w:pPr>
+              <w:jc w:val="both"/>
+              <w:rPr>
+                <w:b/>
+                <w:bCs/>
+                <w:color w:val="auto"/>
+              </w:rPr>
+            </w:pPr>
+            <w:r>
+              <w:rPr>
+                <w:b/>
+                <w:bCs/>
+                <w:color w:val="auto"/>
+              </w:rPr>
+              <w:t>Tipo de documento</w:t>
+            </w:r>
+          </w:p>
+        </w:tc>
+        <w:tc>
+          <w:tcPr>
+            <w:tcW w:w="7897" w:type="dxa"/>
+            <w:shd w:val="clear" w:color="auto" w:fill="4E91CD"/>
+          </w:tcPr>
+          <w:p>
+            <w:pPr>
+              <w:jc w:val="both"/>
+              <w:cnfStyle w:val="000000100000" w:firstRow="0" w:lastRow="0" w:firstColumn="0" w:lastColumn="0" w:oddVBand="0" w:evenVBand="0" w:oddHBand="1" w:evenHBand="0" w:firstRowFirstColumn="0" w:firstRowLastColumn="0" w:lastRowFirstColumn="0" w:lastRowLastColumn="0"/>
+              <w:rPr>
+                <w:color w:val="FFFFFF" w:themeColor="background1"/>
+              </w:rPr>
+            </w:pPr>
+            <w:r>
+              <w:rPr>
+                <w:color w:val="FFFFFF" w:themeColor="background1"/>
+              </w:rPr>
+              <w:t xml:space="preserve">Corporativo – </w:t>
+            </w:r>
+            <w:r>
+              <w:rPr>
+                <w:color w:val="FFFFFF" w:themeColor="background1"/>
+              </w:rPr>
+              <w:t>Visión y Alcance</w:t>
+            </w:r>
+          </w:p>
+        </w:tc>
+      </w:tr>
+      <w:tr>
+        <w:tc>
+          <w:tcPr>
+            <w:cnfStyle w:val="001000000000" w:firstRow="0" w:lastRow="0" w:firstColumn="1" w:lastColumn="0" w:oddVBand="0" w:evenVBand="0" w:oddHBand="0" w:evenHBand="0" w:firstRowFirstColumn="0" w:firstRowLastColumn="0" w:lastRowFirstColumn="0" w:lastRowLastColumn="0"/>
+            <w:tcW w:w="2077" w:type="dxa"/>
+          </w:tcPr>
+          <w:p>
+            <w:pPr>
+              <w:jc w:val="both"/>
+              <w:rPr>
+                <w:b/>
+                <w:bCs/>
+                <w:color w:val="auto"/>
+              </w:rPr>
+            </w:pPr>
+            <w:r>
+              <w:rPr>
+                <w:b/>
+                <w:bCs/>
+                <w:color w:val="auto"/>
+              </w:rPr>
+              <w:t>Versión</w:t>
+            </w:r>
+          </w:p>
+        </w:tc>
+        <w:tc>
+          <w:tcPr>
+            <w:tcW w:w="7897" w:type="dxa"/>
+          </w:tcPr>
+          <w:p>
+            <w:pPr>
+              <w:jc w:val="both"/>
+              <w:cnfStyle w:val="000000000000" w:firstRow="0" w:lastRow="0" w:firstColumn="0" w:lastColumn="0" w:oddVBand="0" w:evenVBand="0" w:oddHBand="0" w:evenHBand="0" w:firstRowFirstColumn="0" w:firstRowLastColumn="0" w:lastRowFirstColumn="0" w:lastRowLastColumn="0"/>
+              <w:rPr>
+                <w:color w:val="auto"/>
+              </w:rPr>
+            </w:pPr>
+            <w:r>
+              <w:rPr>
+                <w:color w:val="auto"/>
+              </w:rPr>
+              <w:t>1.0</w:t>
+            </w:r>
+            <w:r>
+              <w:rPr>
+                <w:color w:val="auto"/>
+              </w:rPr>
+              <w:t>.1</w:t>
+            </w:r>
+          </w:p>
+        </w:tc>
+      </w:tr>
+      <w:tr>
+        <w:trPr>
+          <w:cnfStyle w:val="000000100000" w:firstRow="0" w:lastRow="0" w:firstColumn="0" w:lastColumn="0" w:oddVBand="0" w:evenVBand="0" w:oddHBand="1" w:evenHBand="0" w:firstRowFirstColumn="0" w:firstRowLastColumn="0" w:lastRowFirstColumn="0" w:lastRowLastColumn="0"/>
+        </w:trPr>
+        <w:tc>
+          <w:tcPr>
+            <w:cnfStyle w:val="001000000000" w:firstRow="0" w:lastRow="0" w:firstColumn="1" w:lastColumn="0" w:oddVBand="0" w:evenVBand="0" w:oddHBand="0" w:evenHBand="0" w:firstRowFirstColumn="0" w:firstRowLastColumn="0" w:lastRowFirstColumn="0" w:lastRowLastColumn="0"/>
+            <w:tcW w:w="2077" w:type="dxa"/>
+          </w:tcPr>
+          <w:p>
+            <w:pPr>
+              <w:jc w:val="both"/>
+              <w:rPr>
+                <w:b/>
+                <w:bCs/>
+                <w:color w:val="auto"/>
+              </w:rPr>
+            </w:pPr>
+            <w:r>
+              <w:rPr>
+                <w:b/>
+                <w:bCs/>
+                <w:color w:val="auto"/>
+              </w:rPr>
+              <w:t>Estado</w:t>
+            </w:r>
+          </w:p>
+        </w:tc>
+        <w:tc>
+          <w:tcPr>
+            <w:tcW w:w="7897" w:type="dxa"/>
+            <w:shd w:val="clear" w:color="auto" w:fill="4E91CD"/>
+          </w:tcPr>
+          <w:p>
+            <w:pPr>
+              <w:jc w:val="both"/>
+              <w:cnfStyle w:val="000000100000" w:firstRow="0" w:lastRow="0" w:firstColumn="0" w:lastColumn="0" w:oddVBand="0" w:evenVBand="0" w:oddHBand="1" w:evenHBand="0" w:firstRowFirstColumn="0" w:firstRowLastColumn="0" w:lastRowFirstColumn="0" w:lastRowLastColumn="0"/>
+              <w:rPr>
+                <w:b/>
+                <w:bCs/>
+                <w:color w:val="FFFFFF" w:themeColor="background1"/>
+              </w:rPr>
+            </w:pPr>
+            <w:r>
+              <w:rPr>
+                <w:b/>
+                <w:bCs/>
+                <w:color w:val="FFFFFF" w:themeColor="background1"/>
+              </w:rPr>
+              <w:t>FINALIZADO</w:t>
+            </w:r>
+          </w:p>
+        </w:tc>
+      </w:tr>
+      <w:tr>
+        <w:tc>
+          <w:tcPr>
+            <w:cnfStyle w:val="001000000000" w:firstRow="0" w:lastRow="0" w:firstColumn="1" w:lastColumn="0" w:oddVBand="0" w:evenVBand="0" w:oddHBand="0" w:evenHBand="0" w:firstRowFirstColumn="0" w:firstRowLastColumn="0" w:lastRowFirstColumn="0" w:lastRowLastColumn="0"/>
+            <w:tcW w:w="2077" w:type="dxa"/>
+          </w:tcPr>
+          <w:p>
+            <w:pPr>
+              <w:jc w:val="both"/>
+              <w:rPr>
+                <w:b/>
+                <w:bCs/>
+                <w:color w:val="auto"/>
+              </w:rPr>
+            </w:pPr>
+            <w:r>
+              <w:rPr>
+                <w:b/>
+                <w:bCs/>
+                <w:color w:val="auto"/>
+              </w:rPr>
+              <w:t>Fecha</w:t>
+            </w:r>
+          </w:p>
+        </w:tc>
+        <w:tc>
+          <w:tcPr>
+            <w:tcW w:w="7897" w:type="dxa"/>
+          </w:tcPr>
+          <w:p>
+            <w:pPr>
+              <w:jc w:val="both"/>
+              <w:cnfStyle w:val="000000000000" w:firstRow="0" w:lastRow="0" w:firstColumn="0" w:lastColumn="0" w:oddVBand="0" w:evenVBand="0" w:oddHBand="0" w:evenHBand="0" w:firstRowFirstColumn="0" w:firstRowLastColumn="0" w:lastRowFirstColumn="0" w:lastRowLastColumn="0"/>
+              <w:rPr>
+                <w:color w:val="auto"/>
+              </w:rPr>
+            </w:pPr>
+            <w:r>
+              <w:rPr>
+                <w:color w:val="auto"/>
+              </w:rPr>
+              <w:t>0</w:t>
+            </w:r>
+            <w:r>
+              <w:rPr>
+                <w:color w:val="auto"/>
+              </w:rPr>
+              <w:t>9</w:t>
+            </w:r>
+            <w:r>
+              <w:rPr>
+                <w:color w:val="auto"/>
+              </w:rPr>
+              <w:t>/feb/2026</w:t>
+            </w:r>
+          </w:p>
+        </w:tc>
+      </w:tr>
+      <w:tr>
+        <w:trPr>
+          <w:cnfStyle w:val="000000100000" w:firstRow="0" w:lastRow="0" w:firstColumn="0" w:lastColumn="0" w:oddVBand="0" w:evenVBand="0" w:oddHBand="1" w:evenHBand="0" w:firstRowFirstColumn="0" w:firstRowLastColumn="0" w:lastRowFirstColumn="0" w:lastRowLastColumn="0"/>
+        </w:trPr>
+        <w:tc>
+          <w:tcPr>
+            <w:cnfStyle w:val="001000000000" w:firstRow="0" w:lastRow="0" w:firstColumn="1" w:lastColumn="0" w:oddVBand="0" w:evenVBand="0" w:oddHBand="0" w:evenHBand="0" w:firstRowFirstColumn="0" w:firstRowLastColumn="0" w:lastRowFirstColumn="0" w:lastRowLastColumn="0"/>
+            <w:tcW w:w="2077" w:type="dxa"/>
+          </w:tcPr>
+          <w:p>
+            <w:pPr>
+              <w:jc w:val="both"/>
+              <w:rPr>
+                <w:b/>
+                <w:bCs/>
+                <w:color w:val="auto"/>
+              </w:rPr>
+            </w:pPr>
+            <w:r>
+              <w:rPr>
+                <w:b/>
+                <w:bCs/>
+                <w:color w:val="auto"/>
+              </w:rPr>
+              <w:t>Autor</w:t>
+            </w:r>
+          </w:p>
+        </w:tc>
+        <w:tc>
+          <w:tcPr>
+            <w:tcW w:w="7897" w:type="dxa"/>
+            <w:shd w:val="clear" w:color="auto" w:fill="4E91CD"/>
+          </w:tcPr>
+          <w:p>
+            <w:pPr>
+              <w:jc w:val="both"/>
+              <w:cnfStyle w:val="000000100000" w:firstRow="0" w:lastRow="0" w:firstColumn="0" w:lastColumn="0" w:oddVBand="0" w:evenVBand="0" w:oddHBand="1" w:evenHBand="0" w:firstRowFirstColumn="0" w:firstRowLastColumn="0" w:lastRowFirstColumn="0" w:lastRowLastColumn="0"/>
+              <w:rPr>
+                <w:color w:val="FFFFFF" w:themeColor="background1"/>
+              </w:rPr>
+            </w:pPr>
+            <w:r>
+              <w:rPr>
+                <w:color w:val="FFFFFF" w:themeColor="background1"/>
+              </w:rPr>
+              <w:t>David Cueli</w:t>
+            </w:r>
+          </w:p>
+        </w:tc>
+      </w:tr>
+    </w:tbl>
+    <w:p/>
+    <w:p>
+      <w:pPr>
+        <w:pStyle w:val="Ttulo1"/>
+        <w:rPr>
+          <w:rFonts w:asciiTheme="minorHAnsi" w:hAnsiTheme="minorHAnsi" w:cstheme="minorHAnsi"/>
+        </w:rPr>
+      </w:pPr>
+      <w:r>
+        <w:rPr>
+          <w:rFonts w:asciiTheme="minorHAnsi" w:hAnsiTheme="minorHAnsi" w:cstheme="minorHAnsi"/>
+        </w:rPr>
         <w:t>ÍNDICE</w:t>
       </w:r>
     </w:p>
@@ -1021,7 +1371,35 @@
           <w:rPr>
             <w:rStyle w:val="Hipervnculo"/>
           </w:rPr>
-          <w:t>Alcance incluido (in-scope) para Mexus 0.1.0</w:t>
+          <w:t>Alcance incluido (</w:t>
+        </w:r>
+        <w:proofErr w:type="spellStart"/>
+        <w:r>
+          <w:rPr>
+            <w:rStyle w:val="Hipervnculo"/>
+          </w:rPr>
+          <w:t>in-scope</w:t>
+        </w:r>
+        <w:proofErr w:type="spellEnd"/>
+        <w:r>
+          <w:rPr>
+            <w:rStyle w:val="Hipervnculo"/>
+          </w:rPr>
+          <w:t xml:space="preserve">) para </w:t>
+        </w:r>
+        <w:proofErr w:type="spellStart"/>
+        <w:r>
+          <w:rPr>
+            <w:rStyle w:val="Hipervnculo"/>
+          </w:rPr>
+          <w:t>Mexus</w:t>
+        </w:r>
+        <w:proofErr w:type="spellEnd"/>
+        <w:r>
+          <w:rPr>
+            <w:rStyle w:val="Hipervnculo"/>
+          </w:rPr>
+          <w:t xml:space="preserve"> 0.1.0</w:t>
         </w:r>
       </w:hyperlink>
     </w:p>
@@ -1038,7 +1416,35 @@
           <w:rPr>
             <w:rStyle w:val="Hipervnculo"/>
           </w:rPr>
-          <w:t>Alcance excluido (out-of-scope) para Mexus 0.1.0</w:t>
+          <w:t>Alcance excluido (</w:t>
+        </w:r>
+        <w:proofErr w:type="spellStart"/>
+        <w:r>
+          <w:rPr>
+            <w:rStyle w:val="Hipervnculo"/>
+          </w:rPr>
+          <w:t>out-of-scope</w:t>
+        </w:r>
+        <w:proofErr w:type="spellEnd"/>
+        <w:r>
+          <w:rPr>
+            <w:rStyle w:val="Hipervnculo"/>
+          </w:rPr>
+          <w:t xml:space="preserve">) para </w:t>
+        </w:r>
+        <w:proofErr w:type="spellStart"/>
+        <w:r>
+          <w:rPr>
+            <w:rStyle w:val="Hipervnculo"/>
+          </w:rPr>
+          <w:t>Mexus</w:t>
+        </w:r>
+        <w:proofErr w:type="spellEnd"/>
+        <w:r>
+          <w:rPr>
+            <w:rStyle w:val="Hipervnculo"/>
+          </w:rPr>
+          <w:t xml:space="preserve"> 0.1.0</w:t>
         </w:r>
       </w:hyperlink>
     </w:p>
@@ -1051,11 +1457,19 @@
         </w:numPr>
       </w:pPr>
       <w:hyperlink w:anchor="_STAKEHOLDERS_&amp;_ROLES" w:history="1">
+        <w:proofErr w:type="spellStart"/>
         <w:r>
           <w:rPr>
             <w:rStyle w:val="Hipervnculo"/>
           </w:rPr>
-          <w:t>Stakeholders y roles</w:t>
+          <w:t>Stakeholders</w:t>
+        </w:r>
+        <w:proofErr w:type="spellEnd"/>
+        <w:r>
+          <w:rPr>
+            <w:rStyle w:val="Hipervnculo"/>
+          </w:rPr>
+          <w:t xml:space="preserve"> y roles</w:t>
         </w:r>
       </w:hyperlink>
     </w:p>
@@ -1068,11 +1482,19 @@
         </w:numPr>
       </w:pPr>
       <w:hyperlink w:anchor="_Stakeholders_clave" w:history="1">
+        <w:proofErr w:type="spellStart"/>
         <w:r>
           <w:rPr>
             <w:rStyle w:val="Hipervnculo"/>
           </w:rPr>
-          <w:t>Stakeholders clave</w:t>
+          <w:t>Stakeholders</w:t>
+        </w:r>
+        <w:proofErr w:type="spellEnd"/>
+        <w:r>
+          <w:rPr>
+            <w:rStyle w:val="Hipervnculo"/>
+          </w:rPr>
+          <w:t xml:space="preserve"> clave</w:t>
         </w:r>
       </w:hyperlink>
     </w:p>
@@ -1586,10 +2008,10 @@
         <w:tblLook w:val="04A0" w:firstRow="1" w:lastRow="0" w:firstColumn="1" w:lastColumn="0" w:noHBand="0" w:noVBand="1"/>
       </w:tblPr>
       <w:tblGrid>
-        <w:gridCol w:w="1064"/>
-        <w:gridCol w:w="1612"/>
-        <w:gridCol w:w="6411"/>
-        <w:gridCol w:w="947"/>
+        <w:gridCol w:w="1066"/>
+        <w:gridCol w:w="1614"/>
+        <w:gridCol w:w="6419"/>
+        <w:gridCol w:w="935"/>
       </w:tblGrid>
       <w:tr>
         <w:trPr>
@@ -1598,7 +2020,7 @@
         <w:tc>
           <w:tcPr>
             <w:cnfStyle w:val="001000000100" w:firstRow="0" w:lastRow="0" w:firstColumn="1" w:lastColumn="0" w:oddVBand="0" w:evenVBand="0" w:oddHBand="0" w:evenHBand="0" w:firstRowFirstColumn="1" w:firstRowLastColumn="0" w:lastRowFirstColumn="0" w:lastRowLastColumn="0"/>
-            <w:tcW w:w="530" w:type="pct"/>
+            <w:tcW w:w="531" w:type="pct"/>
             <w:hideMark/>
           </w:tcPr>
           <w:p>
@@ -1684,6 +2106,7 @@
           </w:p>
         </w:tc>
       </w:tr>
+      <w:bookmarkStart w:id="3" w:name="Version_1_0_de_documento"/>
       <w:tr>
         <w:trPr>
           <w:cnfStyle w:val="000000100000" w:firstRow="0" w:lastRow="0" w:firstColumn="0" w:lastColumn="0" w:oddVBand="0" w:evenVBand="0" w:oddHBand="1" w:evenHBand="0" w:firstRowFirstColumn="0" w:firstRowLastColumn="0" w:lastRowFirstColumn="0" w:lastRowLastColumn="0"/>
@@ -1691,7 +2114,7 @@
         <w:tc>
           <w:tcPr>
             <w:cnfStyle w:val="001000000000" w:firstRow="0" w:lastRow="0" w:firstColumn="1" w:lastColumn="0" w:oddVBand="0" w:evenVBand="0" w:oddHBand="0" w:evenHBand="0" w:firstRowFirstColumn="0" w:firstRowLastColumn="0" w:lastRowFirstColumn="0" w:lastRowLastColumn="0"/>
-            <w:tcW w:w="530" w:type="pct"/>
+            <w:tcW w:w="531" w:type="pct"/>
             <w:hideMark/>
           </w:tcPr>
           <w:p>
@@ -1703,16 +2126,54 @@
                 <w:u w:val="none"/>
               </w:rPr>
             </w:pPr>
-            <w:bookmarkStart w:id="3" w:name="Version_1_0_de_documento"/>
             <w:r>
               <w:rPr>
                 <w:rStyle w:val="ancla"/>
                 <w:color w:val="242D5B"/>
                 <w:u w:val="none"/>
               </w:rPr>
+              <w:fldChar w:fldCharType="begin"/>
+            </w:r>
+            <w:r>
+              <w:rPr>
+                <w:rStyle w:val="ancla"/>
+                <w:color w:val="242D5B"/>
+                <w:u w:val="none"/>
+              </w:rPr>
+              <w:instrText>HYPERLINK  \l "Version_1_0_de_documento"</w:instrText>
+            </w:r>
+            <w:r>
+              <w:rPr>
+                <w:rStyle w:val="ancla"/>
+                <w:color w:val="242D5B"/>
+                <w:u w:val="none"/>
+              </w:rPr>
+            </w:r>
+            <w:r>
+              <w:rPr>
+                <w:rStyle w:val="ancla"/>
+                <w:color w:val="242D5B"/>
+                <w:u w:val="none"/>
+              </w:rPr>
+              <w:fldChar w:fldCharType="separate"/>
+            </w:r>
+            <w:r>
+              <w:rPr>
+                <w:rStyle w:val="Hipervnculo"/>
+                <w:i w:val="0"/>
+                <w:iCs w:val="0"/>
+              </w:rPr>
               <w:t>1.0</w:t>
             </w:r>
             <w:bookmarkEnd w:id="3"/>
+            <w:r>
+              <w:rPr>
+                <w:rStyle w:val="ancla"/>
+                <w:color w:val="242D5B"/>
+                <w:u w:val="none"/>
+              </w:rPr>
+              <w:fldChar w:fldCharType="end"/>
+            </w:r>
           </w:p>
         </w:tc>
         <w:tc>
@@ -1799,11 +2260,15 @@
               <w:pStyle w:val="Contenido"/>
               <w:cnfStyle w:val="000000100000" w:firstRow="0" w:lastRow="0" w:firstColumn="0" w:lastColumn="0" w:oddVBand="0" w:evenVBand="0" w:oddHBand="1" w:evenHBand="0" w:firstRowFirstColumn="0" w:firstRowLastColumn="0" w:lastRowFirstColumn="0" w:lastRowLastColumn="0"/>
               <w:rPr>
+                <w:i/>
+                <w:iCs/>
                 <w:color w:val="FFFFFF" w:themeColor="background1"/>
               </w:rPr>
             </w:pPr>
             <w:r>
               <w:rPr>
+                <w:i/>
+                <w:iCs/>
                 <w:color w:val="FFFFFF" w:themeColor="background1"/>
               </w:rPr>
               <w:t>dcueli</w:t>
@@ -1815,7 +2280,7 @@
         <w:tc>
           <w:tcPr>
             <w:cnfStyle w:val="001000000000" w:firstRow="0" w:lastRow="0" w:firstColumn="1" w:lastColumn="0" w:oddVBand="0" w:evenVBand="0" w:oddHBand="0" w:evenHBand="0" w:firstRowFirstColumn="0" w:firstRowLastColumn="0" w:lastRowFirstColumn="0" w:lastRowLastColumn="0"/>
-            <w:tcW w:w="530" w:type="pct"/>
+            <w:tcW w:w="531" w:type="pct"/>
             <w:hideMark/>
           </w:tcPr>
           <w:p>
@@ -1924,11 +2389,23 @@
             <w:pPr>
               <w:pStyle w:val="Contenido"/>
               <w:cnfStyle w:val="000000000000" w:firstRow="0" w:lastRow="0" w:firstColumn="0" w:lastColumn="0" w:oddVBand="0" w:evenVBand="0" w:oddHBand="0" w:evenHBand="0" w:firstRowFirstColumn="0" w:firstRowLastColumn="0" w:lastRowFirstColumn="0" w:lastRowLastColumn="0"/>
+              <w:rPr>
+                <w:i/>
+                <w:iCs/>
+              </w:rPr>
             </w:pPr>
             <w:r>
+              <w:rPr>
+                <w:i/>
+                <w:iCs/>
+              </w:rPr>
               <w:t>d</w:t>
             </w:r>
             <w:r>
+              <w:rPr>
+                <w:i/>
+                <w:iCs/>
+              </w:rPr>
               <w:t>cueli</w:t>
             </w:r>
           </w:p>
@@ -1941,7 +2418,7 @@
         <w:tc>
           <w:tcPr>
             <w:cnfStyle w:val="001000000000" w:firstRow="0" w:lastRow="0" w:firstColumn="1" w:lastColumn="0" w:oddVBand="0" w:evenVBand="0" w:oddHBand="0" w:evenHBand="0" w:firstRowFirstColumn="0" w:firstRowLastColumn="0" w:lastRowFirstColumn="0" w:lastRowLastColumn="0"/>
-            <w:tcW w:w="530" w:type="pct"/>
+            <w:tcW w:w="531" w:type="pct"/>
             <w:hideMark/>
           </w:tcPr>
           <w:p>
@@ -2020,6 +2497,7 @@
                 <w:szCs w:val="18"/>
               </w:rPr>
             </w:pPr>
+            <w:proofErr w:type="spellStart"/>
             <w:r>
               <w:rPr>
                 <w:rStyle w:val="nfasis"/>
@@ -2027,7 +2505,17 @@
                 <w:sz w:val="18"/>
                 <w:szCs w:val="18"/>
               </w:rPr>
-              <w:t>Stakeholders y roles</w:t>
+              <w:t>Stakeholders</w:t>
+            </w:r>
+            <w:proofErr w:type="spellEnd"/>
+            <w:r>
+              <w:rPr>
+                <w:rStyle w:val="nfasis"/>
+                <w:color w:val="FFFFFF" w:themeColor="background1"/>
+                <w:sz w:val="18"/>
+                <w:szCs w:val="18"/>
+              </w:rPr>
+              <w:t xml:space="preserve"> y roles</w:t>
             </w:r>
           </w:p>
           <w:p>
@@ -2118,7 +2606,8 @@
               <w:ind w:left="340" w:hanging="340"/>
               <w:cnfStyle w:val="000000100000" w:firstRow="0" w:lastRow="0" w:firstColumn="0" w:lastColumn="0" w:oddVBand="0" w:evenVBand="0" w:oddHBand="1" w:evenHBand="0" w:firstRowFirstColumn="0" w:firstRowLastColumn="0" w:lastRowFirstColumn="0" w:lastRowLastColumn="0"/>
               <w:rPr>
-                <w:rStyle w:val="nfasis"/>
+                <w:i/>
+                <w:iCs/>
                 <w:color w:val="FFFFFF" w:themeColor="background1"/>
                 <w:sz w:val="18"/>
                 <w:szCs w:val="18"/>
@@ -2134,35 +2623,6 @@
               <w:t xml:space="preserve">Estado del documento </w:t>
             </w:r>
           </w:p>
-          <w:p>
-            <w:pPr>
-              <w:pStyle w:val="Contenido"/>
-              <w:ind w:left="360"/>
-              <w:cnfStyle w:val="000000100000" w:firstRow="0" w:lastRow="0" w:firstColumn="0" w:lastColumn="0" w:oddVBand="0" w:evenVBand="0" w:oddHBand="1" w:evenHBand="0" w:firstRowFirstColumn="0" w:firstRowLastColumn="0" w:lastRowFirstColumn="0" w:lastRowLastColumn="0"/>
-              <w:rPr>
-                <w:color w:val="FFFFFF" w:themeColor="background1"/>
-              </w:rPr>
-            </w:pPr>
-          </w:p>
-          <w:p>
-            <w:pPr>
-              <w:pStyle w:val="Contenido"/>
-              <w:cnfStyle w:val="000000100000" w:firstRow="0" w:lastRow="0" w:firstColumn="0" w:lastColumn="0" w:oddVBand="0" w:evenVBand="0" w:oddHBand="1" w:evenHBand="0" w:firstRowFirstColumn="0" w:firstRowLastColumn="0" w:lastRowFirstColumn="0" w:lastRowLastColumn="0"/>
-              <w:rPr>
-                <w:b/>
-                <w:bCs/>
-                <w:color w:val="FFFFFF" w:themeColor="background1"/>
-              </w:rPr>
-            </w:pPr>
-            <w:r>
-              <w:rPr>
-                <w:b/>
-                <w:bCs/>
-                <w:color w:val="FFFFFF" w:themeColor="background1"/>
-              </w:rPr>
-              <w:t>Documento finalizado</w:t>
-            </w:r>
-          </w:p>
         </w:tc>
         <w:tc>
           <w:tcPr>
@@ -2175,11 +2635,15 @@
               <w:pStyle w:val="Contenido"/>
               <w:cnfStyle w:val="000000100000" w:firstRow="0" w:lastRow="0" w:firstColumn="0" w:lastColumn="0" w:oddVBand="0" w:evenVBand="0" w:oddHBand="1" w:evenHBand="0" w:firstRowFirstColumn="0" w:firstRowLastColumn="0" w:lastRowFirstColumn="0" w:lastRowLastColumn="0"/>
               <w:rPr>
+                <w:i/>
+                <w:iCs/>
                 <w:color w:val="FFFFFF" w:themeColor="background1"/>
               </w:rPr>
             </w:pPr>
             <w:r>
               <w:rPr>
+                <w:i/>
+                <w:iCs/>
                 <w:color w:val="FFFFFF" w:themeColor="background1"/>
               </w:rPr>
               <w:t>dcueli</w:t>
@@ -2191,12 +2655,17 @@
         <w:tc>
           <w:tcPr>
             <w:cnfStyle w:val="001000000000" w:firstRow="0" w:lastRow="0" w:firstColumn="1" w:lastColumn="0" w:oddVBand="0" w:evenVBand="0" w:oddHBand="0" w:evenHBand="0" w:firstRowFirstColumn="0" w:firstRowLastColumn="0" w:lastRowFirstColumn="0" w:lastRowLastColumn="0"/>
-            <w:tcW w:w="530" w:type="pct"/>
+            <w:tcW w:w="531" w:type="pct"/>
             <w:shd w:val="clear" w:color="auto" w:fill="auto"/>
           </w:tcPr>
           <w:p>
             <w:pPr>
               <w:pStyle w:val="Contenido"/>
+              <w:jc w:val="center"/>
+              <w:rPr>
+                <w:i w:val="0"/>
+                <w:iCs w:val="0"/>
+              </w:rPr>
             </w:pPr>
           </w:p>
         </w:tc>
@@ -2244,8 +2713,138 @@
             <w:pPr>
               <w:pStyle w:val="Contenido"/>
               <w:cnfStyle w:val="000000000000" w:firstRow="0" w:lastRow="0" w:firstColumn="0" w:lastColumn="0" w:oddVBand="0" w:evenVBand="0" w:oddHBand="0" w:evenHBand="0" w:firstRowFirstColumn="0" w:firstRowLastColumn="0" w:lastRowFirstColumn="0" w:lastRowLastColumn="0"/>
+              <w:rPr>
+                <w:i/>
+                <w:iCs/>
+              </w:rPr>
             </w:pPr>
             <w:r>
+              <w:rPr>
+                <w:i/>
+                <w:iCs/>
+              </w:rPr>
+              <w:t>dcueli</w:t>
+            </w:r>
+          </w:p>
+        </w:tc>
+      </w:tr>
+      <w:bookmarkStart w:id="4" w:name="Version_1_0_1_de_documento"/>
+      <w:tr>
+        <w:trPr>
+          <w:cnfStyle w:val="000000100000" w:firstRow="0" w:lastRow="0" w:firstColumn="0" w:lastColumn="0" w:oddVBand="0" w:evenVBand="0" w:oddHBand="1" w:evenHBand="0" w:firstRowFirstColumn="0" w:firstRowLastColumn="0" w:lastRowFirstColumn="0" w:lastRowLastColumn="0"/>
+        </w:trPr>
+        <w:tc>
+          <w:tcPr>
+            <w:cnfStyle w:val="001000000000" w:firstRow="0" w:lastRow="0" w:firstColumn="1" w:lastColumn="0" w:oddVBand="0" w:evenVBand="0" w:oddHBand="0" w:evenHBand="0" w:firstRowFirstColumn="0" w:firstRowLastColumn="0" w:lastRowFirstColumn="0" w:lastRowLastColumn="0"/>
+            <w:tcW w:w="531" w:type="pct"/>
+          </w:tcPr>
+          <w:p>
+            <w:pPr>
+              <w:pStyle w:val="Contenido"/>
+              <w:jc w:val="center"/>
+            </w:pPr>
+            <w:r>
+              <w:fldChar w:fldCharType="begin"/>
+            </w:r>
+            <w:r>
+              <w:rPr>
+                <w:i w:val="0"/>
+                <w:iCs w:val="0"/>
+              </w:rPr>
+              <w:instrText>HYPERLINK  \l "Version_1_0_1_de_documento"</w:instrText>
+            </w:r>
+            <w:r>
+              <w:fldChar w:fldCharType="separate"/>
+            </w:r>
+            <w:r>
+              <w:rPr>
+                <w:rStyle w:val="Hipervnculo"/>
+                <w:i w:val="0"/>
+                <w:iCs w:val="0"/>
+              </w:rPr>
+              <w:t>1.0.1</w:t>
+            </w:r>
+            <w:bookmarkEnd w:id="4"/>
+            <w:r>
+              <w:fldChar w:fldCharType="end"/>
+            </w:r>
+          </w:p>
+        </w:tc>
+        <w:tc>
+          <w:tcPr>
+            <w:tcW w:w="0" w:type="auto"/>
+            <w:shd w:val="clear" w:color="auto" w:fill="4E91CD"/>
+          </w:tcPr>
+          <w:p>
+            <w:pPr>
+              <w:pStyle w:val="Contenido"/>
+              <w:cnfStyle w:val="000000100000" w:firstRow="0" w:lastRow="0" w:firstColumn="0" w:lastColumn="0" w:oddVBand="0" w:evenVBand="0" w:oddHBand="1" w:evenHBand="0" w:firstRowFirstColumn="0" w:firstRowLastColumn="0" w:lastRowFirstColumn="0" w:lastRowLastColumn="0"/>
+              <w:rPr>
+                <w:i/>
+                <w:iCs/>
+                <w:color w:val="FFFFFF" w:themeColor="background1"/>
+              </w:rPr>
+            </w:pPr>
+            <w:r>
+              <w:rPr>
+                <w:i/>
+                <w:iCs/>
+                <w:color w:val="FFFFFF" w:themeColor="background1"/>
+              </w:rPr>
+              <w:t>1</w:t>
+            </w:r>
+            <w:r>
+              <w:rPr>
+                <w:color w:val="FFFFFF" w:themeColor="background1"/>
+              </w:rPr>
+              <w:t>0/02/2026</w:t>
+            </w:r>
+          </w:p>
+        </w:tc>
+        <w:tc>
+          <w:tcPr>
+            <w:tcW w:w="0" w:type="auto"/>
+            <w:shd w:val="clear" w:color="auto" w:fill="4E91CD"/>
+          </w:tcPr>
+          <w:p>
+            <w:pPr>
+              <w:pStyle w:val="Contenido"/>
+              <w:cnfStyle w:val="000000100000" w:firstRow="0" w:lastRow="0" w:firstColumn="0" w:lastColumn="0" w:oddVBand="0" w:evenVBand="0" w:oddHBand="1" w:evenHBand="0" w:firstRowFirstColumn="0" w:firstRowLastColumn="0" w:lastRowFirstColumn="0" w:lastRowLastColumn="0"/>
+              <w:rPr>
+                <w:color w:val="FFFFFF" w:themeColor="background1"/>
+              </w:rPr>
+            </w:pPr>
+            <w:r>
+              <w:rPr>
+                <w:b/>
+                <w:bCs/>
+                <w:color w:val="FFFFFF" w:themeColor="background1"/>
+              </w:rPr>
+              <w:t>Documento finalizado</w:t>
+            </w:r>
+          </w:p>
+        </w:tc>
+        <w:tc>
+          <w:tcPr>
+            <w:tcW w:w="0" w:type="auto"/>
+            <w:shd w:val="clear" w:color="auto" w:fill="4E91CD"/>
+          </w:tcPr>
+          <w:p>
+            <w:pPr>
+              <w:pStyle w:val="Contenido"/>
+              <w:cnfStyle w:val="000000100000" w:firstRow="0" w:lastRow="0" w:firstColumn="0" w:lastColumn="0" w:oddVBand="0" w:evenVBand="0" w:oddHBand="1" w:evenHBand="0" w:firstRowFirstColumn="0" w:firstRowLastColumn="0" w:lastRowFirstColumn="0" w:lastRowLastColumn="0"/>
+              <w:rPr>
+                <w:i/>
+                <w:iCs/>
+                <w:color w:val="FFFFFF" w:themeColor="background1"/>
+              </w:rPr>
+            </w:pPr>
+            <w:r>
+              <w:rPr>
+                <w:i/>
+                <w:iCs/>
+                <w:color w:val="FFFFFF" w:themeColor="background1"/>
+              </w:rPr>
               <w:t>dcueli</w:t>
             </w:r>
           </w:p>
@@ -2271,12 +2870,12 @@
           <w:lang w:eastAsia="es-ES"/>
         </w:rPr>
       </w:pPr>
-      <w:bookmarkStart w:id="4" w:name="_Investigación_y_Aprendizaje"/>
-      <w:bookmarkStart w:id="5" w:name="_Desarrollo"/>
-      <w:bookmarkStart w:id="6" w:name="_VISIÓN_DEL_PRODUCTO"/>
-      <w:bookmarkEnd w:id="4"/>
+      <w:bookmarkStart w:id="5" w:name="_Investigación_y_Aprendizaje"/>
+      <w:bookmarkStart w:id="6" w:name="_Desarrollo"/>
+      <w:bookmarkStart w:id="7" w:name="_VISIÓN_DEL_PRODUCTO"/>
       <w:bookmarkEnd w:id="5"/>
       <w:bookmarkEnd w:id="6"/>
+      <w:bookmarkEnd w:id="7"/>
       <w:r>
         <w:rPr>
           <w:lang w:eastAsia="es-ES"/>
@@ -2310,10 +2909,10 @@
           <w:lang w:eastAsia="es-ES"/>
         </w:rPr>
       </w:pPr>
-      <w:bookmarkStart w:id="7" w:name="_Componentes_clave"/>
-      <w:bookmarkStart w:id="8" w:name="_Descripción_general"/>
-      <w:bookmarkEnd w:id="7"/>
+      <w:bookmarkStart w:id="8" w:name="_Componentes_clave"/>
+      <w:bookmarkStart w:id="9" w:name="_Descripción_general"/>
       <w:bookmarkEnd w:id="8"/>
+      <w:bookmarkEnd w:id="9"/>
       <w:r>
         <w:rPr>
           <w:lang w:eastAsia="es-ES"/>
@@ -2337,6 +2936,7 @@
       <w:pPr>
         <w:pStyle w:val="Contenido"/>
       </w:pPr>
+      <w:proofErr w:type="spellStart"/>
       <w:r>
         <w:rPr>
           <w:b/>
@@ -2344,6 +2944,7 @@
         </w:rPr>
         <w:t>Mexus</w:t>
       </w:r>
+      <w:proofErr w:type="spellEnd"/>
       <w:r>
         <w:t xml:space="preserve"> es una aplicación móvil </w:t>
       </w:r>
@@ -2444,6 +3045,7 @@
       <w:r>
         <w:t xml:space="preserve">La visión de </w:t>
       </w:r>
+      <w:proofErr w:type="spellStart"/>
       <w:r>
         <w:rPr>
           <w:b/>
@@ -2451,6 +3053,7 @@
         </w:rPr>
         <w:t>Mexus</w:t>
       </w:r>
+      <w:proofErr w:type="spellEnd"/>
       <w:r>
         <w:t xml:space="preserve"> no es competir en el mercado de aplicaciones, sino:</w:t>
       </w:r>
@@ -2526,6 +3129,7 @@
       <w:pPr>
         <w:pStyle w:val="Contenido"/>
       </w:pPr>
+      <w:proofErr w:type="spellStart"/>
       <w:r>
         <w:rPr>
           <w:b/>
@@ -2533,6 +3137,7 @@
         </w:rPr>
         <w:t>Mexus</w:t>
       </w:r>
+      <w:proofErr w:type="spellEnd"/>
       <w:r>
         <w:t xml:space="preserve"> se concibe como un evolutivo, con una primera versión mínima pero estable y comprensible, sobre la que se puedan introducir y escalar a mejoras futuras de forma controlada.</w:t>
       </w:r>
@@ -2544,19 +3149,19 @@
           <w:lang w:eastAsia="es-ES"/>
         </w:rPr>
       </w:pPr>
-      <w:bookmarkStart w:id="9" w:name="_Estructura_de_carpetas"/>
-      <w:bookmarkEnd w:id="9"/>
+      <w:bookmarkStart w:id="10" w:name="_Estructura_de_carpetas"/>
+      <w:bookmarkEnd w:id="10"/>
     </w:p>
     <w:p>
       <w:pPr>
         <w:pStyle w:val="Ttulo2"/>
       </w:pPr>
-      <w:bookmarkStart w:id="10" w:name="_Mecánicas_implementadas"/>
-      <w:bookmarkStart w:id="11" w:name="_Dificultades_encontradas"/>
-      <w:bookmarkStart w:id="12" w:name="_Problemas_que_resuelve"/>
-      <w:bookmarkEnd w:id="10"/>
+      <w:bookmarkStart w:id="11" w:name="_Mecánicas_implementadas"/>
+      <w:bookmarkStart w:id="12" w:name="_Dificultades_encontradas"/>
+      <w:bookmarkStart w:id="13" w:name="_Problemas_que_resuelve"/>
       <w:bookmarkEnd w:id="11"/>
       <w:bookmarkEnd w:id="12"/>
+      <w:bookmarkEnd w:id="13"/>
       <w:r>
         <w:lastRenderedPageBreak/>
         <w:t>Problemas que resuelve</w:t>
@@ -2774,11 +3379,19 @@
         </w:rPr>
         <w:t xml:space="preserve">instrucciones, </w:t>
       </w:r>
+      <w:proofErr w:type="spellStart"/>
       <w:r>
         <w:rPr>
           <w:lang w:eastAsia="es-ES"/>
         </w:rPr>
-        <w:t>etc; de forma fiable y organizada, sin depender de aplicaciones de terceros que:</w:t>
+        <w:t>etc</w:t>
+      </w:r>
+      <w:proofErr w:type="spellEnd"/>
+      <w:r>
+        <w:rPr>
+          <w:lang w:eastAsia="es-ES"/>
+        </w:rPr>
+        <w:t>; de forma fiable y organizada, sin depender de aplicaciones de terceros que:</w:t>
       </w:r>
     </w:p>
     <w:p>
@@ -3088,6 +3701,7 @@
           <w:lang w:eastAsia="es-ES"/>
         </w:rPr>
       </w:pPr>
+      <w:proofErr w:type="spellStart"/>
       <w:r>
         <w:rPr>
           <w:b/>
@@ -3096,6 +3710,7 @@
         </w:rPr>
         <w:t>Mexus</w:t>
       </w:r>
+      <w:proofErr w:type="spellEnd"/>
       <w:r>
         <w:rPr>
           <w:lang w:eastAsia="es-ES"/>
@@ -3149,6 +3764,7 @@
           <w:lang w:eastAsia="es-ES"/>
         </w:rPr>
       </w:pPr>
+      <w:proofErr w:type="spellStart"/>
       <w:r>
         <w:rPr>
           <w:rStyle w:val="nfasis"/>
@@ -3158,6 +3774,7 @@
         </w:rPr>
         <w:t>Mexus</w:t>
       </w:r>
+      <w:proofErr w:type="spellEnd"/>
       <w:r>
         <w:rPr>
           <w:rStyle w:val="nfasis"/>
@@ -3203,10 +3820,10 @@
           <w:rFonts w:ascii="Calibri Light" w:hAnsi="Calibri Light"/>
         </w:rPr>
       </w:pPr>
-      <w:bookmarkStart w:id="13" w:name="_Cosas_curiosas_implementadas"/>
-      <w:bookmarkStart w:id="14" w:name="_Visión_a_medio"/>
-      <w:bookmarkEnd w:id="13"/>
+      <w:bookmarkStart w:id="14" w:name="_Cosas_curiosas_implementadas"/>
+      <w:bookmarkStart w:id="15" w:name="_Visión_a_medio"/>
       <w:bookmarkEnd w:id="14"/>
+      <w:bookmarkEnd w:id="15"/>
       <w:r>
         <w:rPr>
           <w:rStyle w:val="Ttulo3Car"/>
@@ -3222,8 +3839,9 @@
           <w:lang w:eastAsia="es-ES"/>
         </w:rPr>
       </w:pPr>
-      <w:bookmarkStart w:id="15" w:name="_Patrones_de_diseño"/>
-      <w:bookmarkEnd w:id="15"/>
+      <w:bookmarkStart w:id="16" w:name="_Patrones_de_diseño"/>
+      <w:bookmarkEnd w:id="16"/>
+      <w:proofErr w:type="spellStart"/>
       <w:r>
         <w:rPr>
           <w:b/>
@@ -3232,6 +3850,7 @@
         </w:rPr>
         <w:t>Mexus</w:t>
       </w:r>
+      <w:proofErr w:type="spellEnd"/>
       <w:r>
         <w:rPr>
           <w:lang w:eastAsia="es-ES"/>
@@ -3291,7 +3910,21 @@
           <w:lang w:eastAsia="es-ES"/>
         </w:rPr>
         <w:lastRenderedPageBreak/>
-        <w:t>Mantener una arquitectura limpia que facilite extender el producto sin reescribir la base técnica (plugins, servicios, etc.).</w:t>
+        <w:t>Mantener una arquitectura limpia que facilite extender el producto sin reescribir la base técnica (</w:t>
+      </w:r>
+      <w:proofErr w:type="spellStart"/>
+      <w:r>
+        <w:rPr>
+          <w:lang w:eastAsia="es-ES"/>
+        </w:rPr>
+        <w:t>plugins</w:t>
+      </w:r>
+      <w:proofErr w:type="spellEnd"/>
+      <w:r>
+        <w:rPr>
+          <w:lang w:eastAsia="es-ES"/>
+        </w:rPr>
+        <w:t>, servicios, etc.).</w:t>
       </w:r>
     </w:p>
     <w:p>
@@ -3309,14 +3942,14 @@
           <w:lang w:eastAsia="es-ES"/>
         </w:rPr>
       </w:pPr>
-      <w:bookmarkStart w:id="16" w:name="_Carga_dinámica"/>
-      <w:bookmarkStart w:id="17" w:name="_Elementos_pendientes_de"/>
-      <w:bookmarkStart w:id="18" w:name="_Epílogo"/>
-      <w:bookmarkStart w:id="19" w:name="_OBJETIVOS_DEL_PROYECTO"/>
-      <w:bookmarkEnd w:id="16"/>
+      <w:bookmarkStart w:id="17" w:name="_Carga_dinámica"/>
+      <w:bookmarkStart w:id="18" w:name="_Elementos_pendientes_de"/>
+      <w:bookmarkStart w:id="19" w:name="_Epílogo"/>
+      <w:bookmarkStart w:id="20" w:name="_OBJETIVOS_DEL_PROYECTO"/>
       <w:bookmarkEnd w:id="17"/>
       <w:bookmarkEnd w:id="18"/>
       <w:bookmarkEnd w:id="19"/>
+      <w:bookmarkEnd w:id="20"/>
       <w:r>
         <w:rPr>
           <w:lang w:eastAsia="es-ES"/>
@@ -3347,8 +3980,8 @@
       <w:pPr>
         <w:pStyle w:val="Ttulo2"/>
       </w:pPr>
-      <w:bookmarkStart w:id="20" w:name="_Objetivo_principal"/>
-      <w:bookmarkEnd w:id="20"/>
+      <w:bookmarkStart w:id="21" w:name="_Objetivo_principal"/>
+      <w:bookmarkEnd w:id="21"/>
       <w:r>
         <w:t>Objetivo principal</w:t>
       </w:r>
@@ -3419,10 +4052,10 @@
       <w:pPr>
         <w:pStyle w:val="Ttulo2"/>
       </w:pPr>
-      <w:bookmarkStart w:id="21" w:name="_Objetivos_específicos_de"/>
-      <w:bookmarkStart w:id="22" w:name="_Objetivos_secundarios"/>
-      <w:bookmarkEnd w:id="21"/>
+      <w:bookmarkStart w:id="22" w:name="_Objetivos_específicos_de"/>
+      <w:bookmarkStart w:id="23" w:name="_Objetivos_secundarios"/>
       <w:bookmarkEnd w:id="22"/>
+      <w:bookmarkEnd w:id="23"/>
       <w:r>
         <w:t xml:space="preserve">Objetivos </w:t>
       </w:r>
@@ -3444,6 +4077,7 @@
       <w:r>
         <w:t xml:space="preserve"> (en adelante </w:t>
       </w:r>
+      <w:proofErr w:type="spellStart"/>
       <w:r>
         <w:rPr>
           <w:i/>
@@ -3451,6 +4085,7 @@
         </w:rPr>
         <w:t>crashes</w:t>
       </w:r>
+      <w:proofErr w:type="spellEnd"/>
       <w:r>
         <w:t>)</w:t>
       </w:r>
@@ -3508,7 +4143,15 @@
         <w:t>El inicio del desarrollo</w:t>
       </w:r>
       <w:r>
-        <w:t xml:space="preserve"> de Mexus (MVP) tendrá como objetivos específicos:</w:t>
+        <w:t xml:space="preserve"> de </w:t>
+      </w:r>
+      <w:proofErr w:type="spellStart"/>
+      <w:r>
+        <w:t>Mexus</w:t>
+      </w:r>
+      <w:proofErr w:type="spellEnd"/>
+      <w:r>
+        <w:t xml:space="preserve"> (MVP) tendrá como objetivos específicos:</w:t>
       </w:r>
     </w:p>
     <w:p/>
@@ -3521,17 +4164,27 @@
         </w:numPr>
       </w:pPr>
       <w:r>
-        <w:t xml:space="preserve">Disponer de un proyecto base Angular + Ionic + Capacitor integrado con Android y </w:t>
+        <w:t xml:space="preserve">Disponer de un proyecto base Angular + </w:t>
+      </w:r>
+      <w:proofErr w:type="spellStart"/>
+      <w:r>
+        <w:t>Ionic</w:t>
+      </w:r>
+      <w:proofErr w:type="spellEnd"/>
+      <w:r>
+        <w:t xml:space="preserve"> + Capacitor integrado con Android y </w:t>
       </w:r>
       <w:r>
         <w:t>“</w:t>
       </w:r>
+      <w:proofErr w:type="spellStart"/>
       <w:r>
         <w:rPr>
           <w:rStyle w:val="nfasis"/>
         </w:rPr>
         <w:t>compilable</w:t>
       </w:r>
+      <w:proofErr w:type="spellEnd"/>
       <w:r>
         <w:rPr>
           <w:rStyle w:val="nfasis"/>
@@ -3569,7 +4222,39 @@
         </w:numPr>
       </w:pPr>
       <w:r>
-        <w:t>Establecer la arquitectura de plugins nativos (CallState y Recorder) y un sistema mínimo de logging y manejo de errores</w:t>
+        <w:t xml:space="preserve">Establecer la arquitectura de </w:t>
+      </w:r>
+      <w:proofErr w:type="spellStart"/>
+      <w:r>
+        <w:t>plugins</w:t>
+      </w:r>
+      <w:proofErr w:type="spellEnd"/>
+      <w:r>
+        <w:t xml:space="preserve"> nativos (</w:t>
+      </w:r>
+      <w:proofErr w:type="spellStart"/>
+      <w:r>
+        <w:t>CallState</w:t>
+      </w:r>
+      <w:proofErr w:type="spellEnd"/>
+      <w:r>
+        <w:t xml:space="preserve"> y </w:t>
+      </w:r>
+      <w:proofErr w:type="spellStart"/>
+      <w:r>
+        <w:t>Recorder</w:t>
+      </w:r>
+      <w:proofErr w:type="spellEnd"/>
+      <w:r>
+        <w:t xml:space="preserve">) y un sistema mínimo de </w:t>
+      </w:r>
+      <w:proofErr w:type="spellStart"/>
+      <w:r>
+        <w:t>logging</w:t>
+      </w:r>
+      <w:proofErr w:type="spellEnd"/>
+      <w:r>
+        <w:t xml:space="preserve"> y manejo de errores</w:t>
       </w:r>
       <w:r>
         <w:t xml:space="preserve"> únicamente para el tiempo de desarrollo.</w:t>
@@ -3592,8 +4277,8 @@
       <w:pPr>
         <w:pStyle w:val="Ttulo1"/>
       </w:pPr>
-      <w:bookmarkStart w:id="23" w:name="_ALCANCE_DEL_PRODUCTO"/>
-      <w:bookmarkEnd w:id="23"/>
+      <w:bookmarkStart w:id="24" w:name="_ALCANCE_DEL_PRODUCTO"/>
+      <w:bookmarkEnd w:id="24"/>
       <w:r>
         <w:t>ALCANCE DEL PRODUCTO</w:t>
       </w:r>
@@ -3613,20 +4298,44 @@
       <w:pPr>
         <w:pStyle w:val="Ttulo2"/>
       </w:pPr>
-      <w:bookmarkStart w:id="24" w:name="_Alcance_incluido_(in-scope)"/>
-      <w:bookmarkEnd w:id="24"/>
+      <w:bookmarkStart w:id="25" w:name="_Alcance_incluido_(in-scope)"/>
+      <w:bookmarkEnd w:id="25"/>
     </w:p>
     <w:p>
       <w:pPr>
         <w:pStyle w:val="Ttulo2"/>
       </w:pPr>
       <w:r>
-        <w:t>Alcance incluido (in-scope) para Mexus 0.1.0</w:t>
-      </w:r>
-    </w:p>
-    <w:p>
-      <w:r>
-        <w:t>Para la primera versión (release v0.1.0) se incluyen específicamente:</w:t>
+        <w:t>Alcance incluido (</w:t>
+      </w:r>
+      <w:proofErr w:type="spellStart"/>
+      <w:r>
+        <w:t>in-scope</w:t>
+      </w:r>
+      <w:proofErr w:type="spellEnd"/>
+      <w:r>
+        <w:t xml:space="preserve">) para </w:t>
+      </w:r>
+      <w:proofErr w:type="spellStart"/>
+      <w:r>
+        <w:t>Mexus</w:t>
+      </w:r>
+      <w:proofErr w:type="spellEnd"/>
+      <w:r>
+        <w:t xml:space="preserve"> 0.1.0</w:t>
+      </w:r>
+    </w:p>
+    <w:p>
+      <w:r>
+        <w:t>Para la primera versión (</w:t>
+      </w:r>
+      <w:proofErr w:type="spellStart"/>
+      <w:r>
+        <w:t>release</w:t>
+      </w:r>
+      <w:proofErr w:type="spellEnd"/>
+      <w:r>
+        <w:t xml:space="preserve"> v0.1.0) se incluyen específicamente:</w:t>
       </w:r>
     </w:p>
     <w:p/>
@@ -3668,9 +4377,11 @@
       <w:r>
         <w:t xml:space="preserve">con </w:t>
       </w:r>
+      <w:proofErr w:type="spellStart"/>
       <w:r>
         <w:t>Ionic+Angular</w:t>
       </w:r>
+      <w:proofErr w:type="spellEnd"/>
       <w:r>
         <w:t xml:space="preserve"> como capa UI</w:t>
       </w:r>
@@ -3698,8 +4409,13 @@
           <w:numId w:val="47"/>
         </w:numPr>
       </w:pPr>
-      <w:r>
-        <w:t>Plugins nativos separados para estado de llamada y grabación.</w:t>
+      <w:proofErr w:type="spellStart"/>
+      <w:r>
+        <w:t>Plugins</w:t>
+      </w:r>
+      <w:proofErr w:type="spellEnd"/>
+      <w:r>
+        <w:t xml:space="preserve"> nativos separados para estado de llamada y grabación.</w:t>
       </w:r>
     </w:p>
     <w:p>
@@ -3803,15 +4519,39 @@
       <w:pPr>
         <w:pStyle w:val="Ttulo2"/>
       </w:pPr>
-      <w:bookmarkStart w:id="25" w:name="_Alcance_excluido_(out-of-scope)"/>
-      <w:bookmarkEnd w:id="25"/>
-      <w:r>
-        <w:t>Alcance excluido (out-of-scope) para Mexus 0.1.0</w:t>
-      </w:r>
-    </w:p>
-    <w:p>
-      <w:r>
-        <w:t>Para la primera versión (release v0.1.0) quedan explícitamente fuera:</w:t>
+      <w:bookmarkStart w:id="26" w:name="_Alcance_excluido_(out-of-scope)"/>
+      <w:bookmarkEnd w:id="26"/>
+      <w:r>
+        <w:t>Alcance excluido (</w:t>
+      </w:r>
+      <w:proofErr w:type="spellStart"/>
+      <w:r>
+        <w:t>out-of-scope</w:t>
+      </w:r>
+      <w:proofErr w:type="spellEnd"/>
+      <w:r>
+        <w:t xml:space="preserve">) para </w:t>
+      </w:r>
+      <w:proofErr w:type="spellStart"/>
+      <w:r>
+        <w:t>Mexus</w:t>
+      </w:r>
+      <w:proofErr w:type="spellEnd"/>
+      <w:r>
+        <w:t xml:space="preserve"> 0.1.0</w:t>
+      </w:r>
+    </w:p>
+    <w:p>
+      <w:r>
+        <w:t>Para la primera versión (</w:t>
+      </w:r>
+      <w:proofErr w:type="spellStart"/>
+      <w:r>
+        <w:t>release</w:t>
+      </w:r>
+      <w:proofErr w:type="spellEnd"/>
+      <w:r>
+        <w:t xml:space="preserve"> v0.1.0) quedan explícitamente fuera:</w:t>
       </w:r>
     </w:p>
     <w:p/>
@@ -3824,7 +4564,15 @@
         </w:numPr>
       </w:pPr>
       <w:r>
-        <w:t>Distribución en Google Play, otras stores o canales públicos.</w:t>
+        <w:t xml:space="preserve">Distribución en Google Play, otras </w:t>
+      </w:r>
+      <w:proofErr w:type="spellStart"/>
+      <w:r>
+        <w:t>stores</w:t>
+      </w:r>
+      <w:proofErr w:type="spellEnd"/>
+      <w:r>
+        <w:t xml:space="preserve"> o canales públicos.</w:t>
       </w:r>
     </w:p>
     <w:p>
@@ -3835,8 +4583,13 @@
           <w:numId w:val="48"/>
         </w:numPr>
       </w:pPr>
-      <w:r>
-        <w:t>Backend, servicios remotos o almacenamiento en la nube.</w:t>
+      <w:proofErr w:type="spellStart"/>
+      <w:r>
+        <w:t>Backend</w:t>
+      </w:r>
+      <w:proofErr w:type="spellEnd"/>
+      <w:r>
+        <w:t>, servicios remotos o almacenamiento en la nube.</w:t>
       </w:r>
     </w:p>
     <w:p>
@@ -3872,7 +4625,23 @@
         </w:numPr>
       </w:pPr>
       <w:r>
-        <w:t>Cifrado avanzado, sincronización multi-dispositivo, o integraciones con otras apps.</w:t>
+        <w:t xml:space="preserve">Cifrado avanzado, sincronización </w:t>
+      </w:r>
+      <w:proofErr w:type="spellStart"/>
+      <w:r>
+        <w:t>multi-dispositivo</w:t>
+      </w:r>
+      <w:proofErr w:type="spellEnd"/>
+      <w:r>
+        <w:t xml:space="preserve">, o integraciones con otras </w:t>
+      </w:r>
+      <w:proofErr w:type="gramStart"/>
+      <w:r>
+        <w:t>apps</w:t>
+      </w:r>
+      <w:proofErr w:type="gramEnd"/>
+      <w:r>
+        <w:t>.</w:t>
       </w:r>
     </w:p>
     <w:p/>
@@ -3900,8 +4669,8 @@
       <w:pPr>
         <w:pStyle w:val="Ttulo1"/>
       </w:pPr>
-      <w:bookmarkStart w:id="26" w:name="_STAKEHOLDERS_&amp;_ROLES"/>
-      <w:bookmarkEnd w:id="26"/>
+      <w:bookmarkStart w:id="27" w:name="_STAKEHOLDERS_&amp;_ROLES"/>
+      <w:bookmarkEnd w:id="27"/>
       <w:r>
         <w:t>STAKEHOLDERS &amp; ROLES</w:t>
       </w:r>
@@ -3921,20 +4690,41 @@
       <w:pPr>
         <w:pStyle w:val="Ttulo2"/>
       </w:pPr>
-      <w:bookmarkStart w:id="27" w:name="_Stakeholders_clave"/>
-      <w:bookmarkEnd w:id="27"/>
+      <w:bookmarkStart w:id="28" w:name="_Stakeholders_clave"/>
+      <w:bookmarkEnd w:id="28"/>
     </w:p>
     <w:p>
       <w:pPr>
         <w:pStyle w:val="Ttulo2"/>
       </w:pPr>
-      <w:r>
-        <w:t>Stakeholders clave</w:t>
-      </w:r>
-    </w:p>
-    <w:p>
-      <w:r>
-        <w:t>En este proyecto el stakeholder principal que gestionará Mexus, a efectos de práctica profesional, se identifican los siguientes roles:</w:t>
+      <w:proofErr w:type="spellStart"/>
+      <w:r>
+        <w:t>Stakeholders</w:t>
+      </w:r>
+      <w:proofErr w:type="spellEnd"/>
+      <w:r>
+        <w:t xml:space="preserve"> clave</w:t>
+      </w:r>
+    </w:p>
+    <w:p>
+      <w:r>
+        <w:t xml:space="preserve">En este proyecto el </w:t>
+      </w:r>
+      <w:proofErr w:type="spellStart"/>
+      <w:r>
+        <w:t>stakeholder</w:t>
+      </w:r>
+      <w:proofErr w:type="spellEnd"/>
+      <w:r>
+        <w:t xml:space="preserve"> principal que gestionará </w:t>
+      </w:r>
+      <w:proofErr w:type="spellStart"/>
+      <w:r>
+        <w:t>Mexus</w:t>
+      </w:r>
+      <w:proofErr w:type="spellEnd"/>
+      <w:r>
+        <w:t>, a efectos de práctica profesional, se identifican los siguientes roles:</w:t>
       </w:r>
     </w:p>
     <w:p/>
@@ -3946,6 +4736,7 @@
           <w:numId w:val="48"/>
         </w:numPr>
       </w:pPr>
+      <w:proofErr w:type="spellStart"/>
       <w:r>
         <w:rPr>
           <w:b/>
@@ -3953,7 +4744,17 @@
           <w:i/>
           <w:iCs/>
         </w:rPr>
-        <w:t>Product Owner (PO)</w:t>
+        <w:t>Product</w:t>
+      </w:r>
+      <w:proofErr w:type="spellEnd"/>
+      <w:r>
+        <w:rPr>
+          <w:b/>
+          <w:bCs/>
+          <w:i/>
+          <w:iCs/>
+        </w:rPr>
+        <w:t xml:space="preserve"> Owner (PO)</w:t>
       </w:r>
       <w:r>
         <w:t>: define la visión, prioriza el backlog y decide el contenido de cada versión.</w:t>
@@ -3995,7 +4796,27 @@
           <w:i/>
           <w:iCs/>
         </w:rPr>
-        <w:t>Software Architect (SA)</w:t>
+        <w:t xml:space="preserve">Software </w:t>
+      </w:r>
+      <w:proofErr w:type="spellStart"/>
+      <w:r>
+        <w:rPr>
+          <w:b/>
+          <w:bCs/>
+          <w:i/>
+          <w:iCs/>
+        </w:rPr>
+        <w:t>Architect</w:t>
+      </w:r>
+      <w:proofErr w:type="spellEnd"/>
+      <w:r>
+        <w:rPr>
+          <w:b/>
+          <w:bCs/>
+          <w:i/>
+          <w:iCs/>
+        </w:rPr>
+        <w:t xml:space="preserve"> (SA)</w:t>
       </w:r>
       <w:r>
         <w:t>: define la arquitectura técnica, módulos y decisiones de diseño clave.</w:t>
@@ -4016,8 +4837,19 @@
           <w:i/>
           <w:iCs/>
         </w:rPr>
-        <w:t>Desarrollador / Fullstack</w:t>
-      </w:r>
+        <w:t xml:space="preserve">Desarrollador / </w:t>
+      </w:r>
+      <w:proofErr w:type="spellStart"/>
+      <w:r>
+        <w:rPr>
+          <w:b/>
+          <w:bCs/>
+          <w:i/>
+          <w:iCs/>
+        </w:rPr>
+        <w:t>Fullstack</w:t>
+      </w:r>
+      <w:proofErr w:type="spellEnd"/>
       <w:r>
         <w:t>: implementa el código.</w:t>
       </w:r>
@@ -4037,10 +4869,29 @@
           <w:i/>
           <w:iCs/>
         </w:rPr>
-        <w:t>Scrum Master</w:t>
-      </w:r>
-      <w:r>
-        <w:t>: facilita la aplicación de prácticas ágiles (sprints, revisión, retrospectiva), incluso en equipo unipersonal.</w:t>
+        <w:t xml:space="preserve">Scrum </w:t>
+      </w:r>
+      <w:proofErr w:type="gramStart"/>
+      <w:r>
+        <w:rPr>
+          <w:b/>
+          <w:bCs/>
+          <w:i/>
+          <w:iCs/>
+        </w:rPr>
+        <w:t>Master</w:t>
+      </w:r>
+      <w:proofErr w:type="gramEnd"/>
+      <w:r>
+        <w:t>: facilita la aplicación de prácticas ágiles (</w:t>
+      </w:r>
+      <w:proofErr w:type="spellStart"/>
+      <w:r>
+        <w:t>sprints</w:t>
+      </w:r>
+      <w:proofErr w:type="spellEnd"/>
+      <w:r>
+        <w:t>, revisión, retrospectiva), incluso en equipo unipersonal.</w:t>
       </w:r>
     </w:p>
     <w:p/>
@@ -4067,8 +4918,8 @@
           </w14:textOutline>
         </w:rPr>
       </w:pPr>
-      <w:bookmarkStart w:id="28" w:name="_BENEFICIOS_ESPERADOS"/>
-      <w:bookmarkEnd w:id="28"/>
+      <w:bookmarkStart w:id="29" w:name="_BENEFICIOS_ESPERADOS"/>
+      <w:bookmarkEnd w:id="29"/>
       <w:r>
         <w:br w:type="page"/>
       </w:r>
@@ -4098,8 +4949,8 @@
       <w:pPr>
         <w:pStyle w:val="Ttulo2"/>
       </w:pPr>
-      <w:bookmarkStart w:id="29" w:name="_Para_el_usuario"/>
-      <w:bookmarkEnd w:id="29"/>
+      <w:bookmarkStart w:id="30" w:name="_Para_el_usuario"/>
+      <w:bookmarkEnd w:id="30"/>
       <w:r>
         <w:t>Para el usuario</w:t>
       </w:r>
@@ -4133,8 +4984,8 @@
       <w:pPr>
         <w:pStyle w:val="Ttulo1"/>
       </w:pPr>
-      <w:bookmarkStart w:id="30" w:name="_SUPUESTOS_Y_RESTRICCIONES"/>
-      <w:bookmarkEnd w:id="30"/>
+      <w:bookmarkStart w:id="31" w:name="_SUPUESTOS_Y_RESTRICCIONES"/>
+      <w:bookmarkEnd w:id="31"/>
       <w:r>
         <w:t>S</w:t>
       </w:r>
@@ -4154,8 +5005,8 @@
       </w:hyperlink>
     </w:p>
     <w:p>
-      <w:bookmarkStart w:id="31" w:name="_Supuestos"/>
-      <w:bookmarkEnd w:id="31"/>
+      <w:bookmarkStart w:id="32" w:name="_Supuestos"/>
+      <w:bookmarkEnd w:id="32"/>
     </w:p>
     <w:p>
       <w:pPr>
@@ -4174,7 +5025,15 @@
         </w:numPr>
       </w:pPr>
       <w:r>
-        <w:t>El proyecto se desarrolla para uso personal, sin usuarios externos, excepto para pruebas o testing.</w:t>
+        <w:t xml:space="preserve">El proyecto se desarrolla para uso personal, sin usuarios externos, excepto para pruebas o </w:t>
+      </w:r>
+      <w:proofErr w:type="spellStart"/>
+      <w:r>
+        <w:t>testing</w:t>
+      </w:r>
+      <w:proofErr w:type="spellEnd"/>
+      <w:r>
+        <w:t>.</w:t>
       </w:r>
     </w:p>
     <w:p>
@@ -4210,8 +5069,13 @@
         </w:numPr>
       </w:pPr>
       <w:r>
-        <w:t>Usuario consciente del funcionamiento de la app</w:t>
-      </w:r>
+        <w:t xml:space="preserve">Usuario consciente del funcionamiento de la </w:t>
+      </w:r>
+      <w:proofErr w:type="gramStart"/>
+      <w:r>
+        <w:t>app</w:t>
+      </w:r>
+      <w:proofErr w:type="gramEnd"/>
     </w:p>
     <w:p>
       <w:pPr>
@@ -4229,8 +5093,8 @@
       <w:pPr>
         <w:pStyle w:val="Ttulo2"/>
       </w:pPr>
-      <w:bookmarkStart w:id="32" w:name="_Restricciones"/>
-      <w:bookmarkEnd w:id="32"/>
+      <w:bookmarkStart w:id="33" w:name="_Restricciones"/>
+      <w:bookmarkEnd w:id="33"/>
       <w:r>
         <w:t>Restricciones</w:t>
       </w:r>
@@ -4258,12 +5122,14 @@
       <w:r>
         <w:t>Restricciones legales potenciales relacionadas con el registro de llamadas y protección de datos, que deberán ser analizadas y reflejadas en textos de consentimiento y descargo de responsabilidades (</w:t>
       </w:r>
+      <w:proofErr w:type="spellStart"/>
       <w:r>
         <w:rPr>
           <w:rStyle w:val="nfasis"/>
         </w:rPr>
         <w:t>disclaimers</w:t>
       </w:r>
+      <w:proofErr w:type="spellEnd"/>
       <w:r>
         <w:t>)</w:t>
       </w:r>
@@ -4277,7 +5143,15 @@
         </w:numPr>
       </w:pPr>
       <w:r>
-        <w:t>Uso de APIs nativas para llamadas</w:t>
+        <w:t xml:space="preserve">Uso de </w:t>
+      </w:r>
+      <w:proofErr w:type="spellStart"/>
+      <w:r>
+        <w:t>APIs</w:t>
+      </w:r>
+      <w:proofErr w:type="spellEnd"/>
+      <w:r>
+        <w:t xml:space="preserve"> nativas para llamadas</w:t>
       </w:r>
       <w:r>
         <w:t>.</w:t>
@@ -4320,8 +5194,8 @@
       <w:pPr>
         <w:pStyle w:val="Ttulo1"/>
       </w:pPr>
-      <w:bookmarkStart w:id="33" w:name="_CRITERIOS_DE_ÉXITO"/>
-      <w:bookmarkEnd w:id="33"/>
+      <w:bookmarkStart w:id="34" w:name="_CRITERIOS_DE_ÉXITO"/>
+      <w:bookmarkEnd w:id="34"/>
       <w:r>
         <w:t>CRITERIOS DE ÉXITO</w:t>
       </w:r>
@@ -4371,7 +5245,15 @@
         </w:numPr>
       </w:pPr>
       <w:r>
-        <w:t>no se producen crashes en uso normal,</w:t>
+        <w:t xml:space="preserve">no se producen </w:t>
+      </w:r>
+      <w:proofErr w:type="spellStart"/>
+      <w:r>
+        <w:t>crashes</w:t>
+      </w:r>
+      <w:proofErr w:type="spellEnd"/>
+      <w:r>
+        <w:t xml:space="preserve"> en uso normal,</w:t>
       </w:r>
     </w:p>
     <w:p>
@@ -4403,8 +5285,8 @@
       <w:pPr>
         <w:pStyle w:val="Ttulo1"/>
       </w:pPr>
-      <w:bookmarkStart w:id="34" w:name="_ESTADO_DEL_DOCUMENTO"/>
-      <w:bookmarkEnd w:id="34"/>
+      <w:bookmarkStart w:id="35" w:name="_ESTADO_DEL_DOCUMENTO"/>
+      <w:bookmarkEnd w:id="35"/>
       <w:r>
         <w:t>ESTADO DEL DOCUMENTO</w:t>
       </w:r>
@@ -4428,15 +5310,43 @@
           <w:ilvl w:val="0"/>
           <w:numId w:val="54"/>
         </w:numPr>
-      </w:pPr>
-      <w:hyperlink w:anchor="Version_1_0_de_documento" w:history="1">
-        <w:r>
-          <w:rPr>
-            <w:rStyle w:val="Hipervnculo"/>
-          </w:rPr>
-          <w:t>Versión: 1.0</w:t>
-        </w:r>
-      </w:hyperlink>
+        <w:rPr>
+          <w:rStyle w:val="Hipervnculo"/>
+        </w:rPr>
+      </w:pPr>
+      <w:r>
+        <w:fldChar w:fldCharType="begin"/>
+      </w:r>
+      <w:r>
+        <w:instrText>HYPERLINK  \l "Version_1_0_1_de_documento"</w:instrText>
+      </w:r>
+      <w:r>
+        <w:fldChar w:fldCharType="separate"/>
+      </w:r>
+      <w:r>
+        <w:rPr>
+          <w:rStyle w:val="Hipervnculo"/>
+        </w:rPr>
+        <w:t>Versión: 1</w:t>
+      </w:r>
+      <w:r>
+        <w:rPr>
+          <w:rStyle w:val="Hipervnculo"/>
+        </w:rPr>
+        <w:t>.</w:t>
+      </w:r>
+      <w:r>
+        <w:rPr>
+          <w:rStyle w:val="Hipervnculo"/>
+        </w:rPr>
+        <w:t>0</w:t>
+      </w:r>
+      <w:r>
+        <w:rPr>
+          <w:rStyle w:val="Hipervnculo"/>
+        </w:rPr>
+        <w:t>.1</w:t>
+      </w:r>
     </w:p>
     <w:p>
       <w:pPr>
@@ -4447,13 +5357,18 @@
         </w:numPr>
       </w:pPr>
       <w:r>
-        <w:t>Estado: Borrador validable</w:t>
-      </w:r>
-    </w:p>
-    <w:p>
-      <w:pPr>
-        <w:pStyle w:val="Contenido"/>
-      </w:pPr>
+        <w:fldChar w:fldCharType="end"/>
+      </w:r>
+      <w:r>
+        <w:t xml:space="preserve">Estado: </w:t>
+      </w:r>
+      <w:r>
+        <w:rPr>
+          <w:b/>
+          <w:bCs/>
+        </w:rPr>
+        <w:t>FINALIZADO</w:t>
+      </w:r>
     </w:p>
     <w:sectPr>
       <w:headerReference w:type="default" r:id="rId14"/>
@@ -4913,12 +5828,14 @@
               <w:i/>
             </w:rPr>
           </w:pPr>
+          <w:proofErr w:type="spellStart"/>
           <w:r>
             <w:rPr>
               <w:i/>
             </w:rPr>
             <w:t>Mexus</w:t>
           </w:r>
+          <w:proofErr w:type="spellEnd"/>
         </w:p>
       </w:tc>
     </w:tr>
@@ -4969,7 +5886,7 @@
         <v:path o:extrusionok="f" gradientshapeok="t" o:connecttype="rect"/>
         <o:lock v:ext="edit" aspectratio="t"/>
       </v:shapetype>
-      <v:shape id="_x0000_i1025" type="#_x0000_t75" style="width:441.45pt;height:305.1pt" o:bullet="t">
+      <v:shape id="_x0000_i1025" type="#_x0000_t75" style="width:441.8pt;height:304.7pt" o:bullet="t">
         <v:imagedata r:id="rId1" o:title="folder-309052_1280[1]"/>
       </v:shape>
     </w:pict>
@@ -12095,7 +13012,7 @@
     <w:autoRedefine/>
     <w:uiPriority w:val="4"/>
     <w:qFormat/>
-    <w:rsid w:val="008352C1"/>
+    <w:rsid w:val="00C94CEF"/>
     <w:pPr>
       <w:keepNext/>
       <w:shd w:val="solid" w:color="4E91CD" w:fill="FFFFFF" w:themeFill="background1"/>
@@ -12208,6 +13125,7 @@
   <w:style w:type="character" w:default="1" w:styleId="Fuentedeprrafopredeter">
     <w:name w:val="Default Paragraph Font"/>
     <w:uiPriority w:val="1"/>
+    <w:semiHidden/>
     <w:unhideWhenUsed/>
   </w:style>
   <w:style w:type="table" w:default="1" w:styleId="Tablanormal">
@@ -12327,10 +13245,9 @@
     <w:basedOn w:val="Fuentedeprrafopredeter"/>
     <w:link w:val="Ttulo1"/>
     <w:uiPriority w:val="4"/>
-    <w:rsid w:val="008352C1"/>
+    <w:rsid w:val="00C94CEF"/>
     <w:rPr>
       <w:rFonts w:ascii="Calibri Light" w:eastAsiaTheme="majorEastAsia" w:hAnsi="Calibri Light" w:cstheme="majorBidi"/>
-      <w:b/>
       <w:color w:val="FFFFFF" w:themeColor="background1"/>
       <w:kern w:val="28"/>
       <w:sz w:val="44"/>
@@ -13019,7 +13936,7 @@
     <w:name w:val="ancla"/>
     <w:basedOn w:val="Hipervnculo"/>
     <w:uiPriority w:val="1"/>
-    <w:rsid w:val="00CA475D"/>
+    <w:rsid w:val="00C94CEF"/>
     <w:rPr>
       <w:rFonts w:asciiTheme="minorHAnsi" w:hAnsiTheme="minorHAnsi"/>
       <w:i/>
@@ -13085,6 +14002,145 @@
       <w:sz w:val="20"/>
       <w:szCs w:val="20"/>
     </w:rPr>
+  </w:style>
+  <w:style w:type="table" w:styleId="Tablaconcuadrcula7concolores-nfasis1">
+    <w:name w:val="Grid Table 7 Colorful Accent 1"/>
+    <w:basedOn w:val="Tablanormal"/>
+    <w:uiPriority w:val="52"/>
+    <w:rsid w:val="002630D3"/>
+    <w:pPr>
+      <w:spacing w:after="0" w:line="240" w:lineRule="auto"/>
+    </w:pPr>
+    <w:rPr>
+      <w:color w:val="013A57" w:themeColor="accent1" w:themeShade="BF"/>
+    </w:rPr>
+    <w:tblPr>
+      <w:tblStyleRowBandSize w:val="1"/>
+      <w:tblStyleColBandSize w:val="1"/>
+      <w:tblBorders>
+        <w:top w:val="single" w:sz="4" w:space="0" w:color="18AFFB" w:themeColor="accent1" w:themeTint="99"/>
+        <w:left w:val="single" w:sz="4" w:space="0" w:color="18AFFB" w:themeColor="accent1" w:themeTint="99"/>
+        <w:bottom w:val="single" w:sz="4" w:space="0" w:color="18AFFB" w:themeColor="accent1" w:themeTint="99"/>
+        <w:right w:val="single" w:sz="4" w:space="0" w:color="18AFFB" w:themeColor="accent1" w:themeTint="99"/>
+        <w:insideH w:val="single" w:sz="4" w:space="0" w:color="18AFFB" w:themeColor="accent1" w:themeTint="99"/>
+        <w:insideV w:val="single" w:sz="4" w:space="0" w:color="18AFFB" w:themeColor="accent1" w:themeTint="99"/>
+      </w:tblBorders>
+    </w:tblPr>
+    <w:tblStylePr w:type="firstRow">
+      <w:rPr>
+        <w:b/>
+        <w:bCs/>
+      </w:rPr>
+      <w:tblPr/>
+      <w:tcPr>
+        <w:tcBorders>
+          <w:top w:val="nil"/>
+          <w:left w:val="nil"/>
+          <w:right w:val="nil"/>
+          <w:insideH w:val="nil"/>
+          <w:insideV w:val="nil"/>
+        </w:tcBorders>
+        <w:shd w:val="clear" w:color="auto" w:fill="FFFFFF" w:themeFill="background1"/>
+      </w:tcPr>
+    </w:tblStylePr>
+    <w:tblStylePr w:type="lastRow">
+      <w:rPr>
+        <w:b/>
+        <w:bCs/>
+      </w:rPr>
+      <w:tblPr/>
+      <w:tcPr>
+        <w:tcBorders>
+          <w:left w:val="nil"/>
+          <w:bottom w:val="nil"/>
+          <w:right w:val="nil"/>
+          <w:insideH w:val="nil"/>
+          <w:insideV w:val="nil"/>
+        </w:tcBorders>
+        <w:shd w:val="clear" w:color="auto" w:fill="FFFFFF" w:themeFill="background1"/>
+      </w:tcPr>
+    </w:tblStylePr>
+    <w:tblStylePr w:type="firstCol">
+      <w:pPr>
+        <w:jc w:val="right"/>
+      </w:pPr>
+      <w:rPr>
+        <w:i/>
+        <w:iCs/>
+      </w:rPr>
+      <w:tblPr/>
+      <w:tcPr>
+        <w:tcBorders>
+          <w:top w:val="nil"/>
+          <w:left w:val="nil"/>
+          <w:bottom w:val="nil"/>
+          <w:insideH w:val="nil"/>
+          <w:insideV w:val="nil"/>
+        </w:tcBorders>
+        <w:shd w:val="clear" w:color="auto" w:fill="FFFFFF" w:themeFill="background1"/>
+      </w:tcPr>
+    </w:tblStylePr>
+    <w:tblStylePr w:type="lastCol">
+      <w:rPr>
+        <w:i/>
+        <w:iCs/>
+      </w:rPr>
+      <w:tblPr/>
+      <w:tcPr>
+        <w:tcBorders>
+          <w:top w:val="nil"/>
+          <w:bottom w:val="nil"/>
+          <w:right w:val="nil"/>
+          <w:insideH w:val="nil"/>
+          <w:insideV w:val="nil"/>
+        </w:tcBorders>
+        <w:shd w:val="clear" w:color="auto" w:fill="FFFFFF" w:themeFill="background1"/>
+      </w:tcPr>
+    </w:tblStylePr>
+    <w:tblStylePr w:type="band1Vert">
+      <w:tblPr/>
+      <w:tcPr>
+        <w:shd w:val="clear" w:color="auto" w:fill="B1E4FD" w:themeFill="accent1" w:themeFillTint="33"/>
+      </w:tcPr>
+    </w:tblStylePr>
+    <w:tblStylePr w:type="band1Horz">
+      <w:tblPr/>
+      <w:tcPr>
+        <w:shd w:val="clear" w:color="auto" w:fill="B1E4FD" w:themeFill="accent1" w:themeFillTint="33"/>
+      </w:tcPr>
+    </w:tblStylePr>
+    <w:tblStylePr w:type="neCell">
+      <w:tblPr/>
+      <w:tcPr>
+        <w:tcBorders>
+          <w:bottom w:val="single" w:sz="4" w:space="0" w:color="18AFFB" w:themeColor="accent1" w:themeTint="99"/>
+        </w:tcBorders>
+      </w:tcPr>
+    </w:tblStylePr>
+    <w:tblStylePr w:type="nwCell">
+      <w:tblPr/>
+      <w:tcPr>
+        <w:tcBorders>
+          <w:bottom w:val="single" w:sz="4" w:space="0" w:color="18AFFB" w:themeColor="accent1" w:themeTint="99"/>
+        </w:tcBorders>
+      </w:tcPr>
+    </w:tblStylePr>
+    <w:tblStylePr w:type="seCell">
+      <w:tblPr/>
+      <w:tcPr>
+        <w:tcBorders>
+          <w:top w:val="single" w:sz="4" w:space="0" w:color="18AFFB" w:themeColor="accent1" w:themeTint="99"/>
+        </w:tcBorders>
+      </w:tcPr>
+    </w:tblStylePr>
+    <w:tblStylePr w:type="swCell">
+      <w:tblPr/>
+      <w:tcPr>
+        <w:tcBorders>
+          <w:top w:val="single" w:sz="4" w:space="0" w:color="18AFFB" w:themeColor="accent1" w:themeTint="99"/>
+        </w:tcBorders>
+      </w:tcPr>
+    </w:tblStylePr>
   </w:style>
 </w:styles>
 </file>
@@ -13226,7 +14282,6 @@
     <w:sig w:usb0="E4002EFF" w:usb1="C200247B" w:usb2="00000009" w:usb3="00000000" w:csb0="000001FF" w:csb1="00000000"/>
   </w:font>
   <w:font w:name="MS Mincho">
-    <w:altName w:val="ＭＳ 明朝"/>
     <w:panose1 w:val="02020609040205080304"/>
     <w:charset w:val="80"/>
     <w:family w:val="modern"/>
@@ -13308,15 +14363,18 @@
     <w:rsid w:val="00130F2A"/>
     <w:rsid w:val="001448B7"/>
     <w:rsid w:val="001D7413"/>
+    <w:rsid w:val="00204B26"/>
     <w:rsid w:val="0022094C"/>
     <w:rsid w:val="0023140F"/>
     <w:rsid w:val="002C5662"/>
     <w:rsid w:val="002D7BDE"/>
+    <w:rsid w:val="003972D6"/>
     <w:rsid w:val="004010E7"/>
     <w:rsid w:val="00484ABF"/>
     <w:rsid w:val="005B625B"/>
     <w:rsid w:val="006B176B"/>
     <w:rsid w:val="00960C1A"/>
+    <w:rsid w:val="00C75D03"/>
     <w:rsid w:val="00C94860"/>
     <w:rsid w:val="00D6343F"/>
     <w:rsid w:val="00E62476"/>

</xml_diff>